<commit_message>
Remove Calendar & Class Schedule step from Advanced Syllabus Generator
This generator is for asynchronous / self-paced courses, which don't
meet at fixed times, so the wizard no longer collects class sessions or
holidays. Collapses the workflow from 6 phases to 5 (Instructor,
Documents, Curriculum, Review, Export), drops the now-unused School
Calendar / Class Schedule upload options in the Documents step, and
removes the dead schedule/holiday state and rendering code from exports.

Updates README.md, User_Guide.html, and User_Guide_Complete.docx to match
the new 5-phase workflow.

Co-Authored-By: Claude Sonnet 5 <noreply@anthropic.com>
Claude-Session: https://claude.ai/code/session_0159vjjwxKjrJyst8ZT8XF2Q
</commit_message>
<xml_diff>
--- a/advanced-syllabus-generator/User_Guide_Complete.docx
+++ b/advanced-syllabus-generator/User_Guide_Complete.docx
@@ -166,7 +166,7 @@
         <w:spacing w:after="80"/>
       </w:pPr>
       <w:r>
-        <w:t xml:space="preserve">   • Phase 3: Calendar &amp; Class Schedule</w:t>
+        <w:t xml:space="preserve">   • Phase 3: Curriculum &amp; Grading</w:t>
       </w:r>
     </w:p>
     <w:p>
@@ -174,7 +174,7 @@
         <w:spacing w:after="80"/>
       </w:pPr>
       <w:r>
-        <w:t xml:space="preserve">   • Phase 4: Curriculum &amp; Grading</w:t>
+        <w:t xml:space="preserve">   • Phase 4: Review &amp; Customize</w:t>
       </w:r>
     </w:p>
     <w:p>
@@ -182,15 +182,7 @@
         <w:spacing w:after="80"/>
       </w:pPr>
       <w:r>
-        <w:t xml:space="preserve">   • Phase 5: Review &amp; Customize</w:t>
-      </w:r>
-    </w:p>
-    <w:p>
-      <w:pPr>
-        <w:spacing w:after="80"/>
-      </w:pPr>
-      <w:r>
-        <w:t xml:space="preserve">   • Phase 6: Export Your Syllabus</w:t>
+        <w:t xml:space="preserve">   • Phase 5: Export Your Syllabus</w:t>
       </w:r>
     </w:p>
     <w:p>
@@ -909,7 +901,7 @@
         <w:spacing w:after="60"/>
       </w:pPr>
       <w:r>
-        <w:t xml:space="preserve">Progress bar appears: Shows 6 numbered circles at the top (1-6)</w:t>
+        <w:t xml:space="preserve">Progress bar appears: Shows 5 numbered circles at the top (1-5)</w:t>
       </w:r>
     </w:p>
     <w:p>
@@ -986,7 +978,7 @@
         <w:spacing w:after="80"/>
       </w:pPr>
       <w:r>
-        <w:t xml:space="preserve">The application is divided into 6 phases, each building on the previous one:</w:t>
+        <w:t xml:space="preserve">The application is divided into 5 phases, each building on the previous one. There is no calendar or class-schedule step — this generator is built for asynchronous / self-paced courses that don't meet at fixed times.</w:t>
       </w:r>
     </w:p>
     <w:p>
@@ -998,7 +990,7 @@
           <w:b/>
           <w:bCs/>
         </w:rPr>
-        <w:t xml:space="preserve">Phase 1 → Phase 2 → Phase 3 → Phase 4 → Phase 5 → Phase 6</w:t>
+        <w:t xml:space="preserve">Phase 1 → Phase 2 → Phase 3 → Phase 4 → Phase 5</w:t>
       </w:r>
     </w:p>
     <w:p>
@@ -1715,7 +1707,7 @@
         <w:spacing w:after="80"/>
       </w:pPr>
       <w:r>
-        <w:t xml:space="preserve">Uploading documents saves time by automatically extracting key information:</w:t>
+        <w:t xml:space="preserve">Uploading your program of studies saves time by automatically extracting key information:</w:t>
       </w:r>
     </w:p>
     <w:p>
@@ -1729,32 +1721,6 @@
       </w:pPr>
       <w:r>
         <w:t xml:space="preserve">Program of Studies: Extracts units, learning outcomes, weight percentages</w:t>
-      </w:r>
-    </w:p>
-    <w:p>
-      <w:pPr>
-        <w:pStyle w:val="ListParagraph"/>
-        <w:numPr>
-          <w:ilvl w:val="0"/>
-          <w:numId w:val="2"/>
-        </w:numPr>
-        <w:spacing w:after="60"/>
-      </w:pPr>
-      <w:r>
-        <w:t xml:space="preserve">School Calendar: Identifies holidays, breaks, PD days, instructional days</w:t>
-      </w:r>
-    </w:p>
-    <w:p>
-      <w:pPr>
-        <w:pStyle w:val="ListParagraph"/>
-        <w:numPr>
-          <w:ilvl w:val="0"/>
-          <w:numId w:val="2"/>
-        </w:numPr>
-        <w:spacing w:after="60"/>
-      </w:pPr>
-      <w:r>
-        <w:t xml:space="preserve">Class Schedule: Detects which days your class meets and what times</w:t>
       </w:r>
     </w:p>
     <w:p>
@@ -2015,148 +1981,6 @@
           </w:p>
         </w:tc>
       </w:tr>
-      <w:tr>
-        <w:tc>
-          <w:tcPr>
-            <w:tcW w:type="dxa" w:w="3120"/>
-            <w:tcBorders>
-              <w:top w:val="single" w:color="CCCCCC" w:sz="1"/>
-              <w:left w:val="single" w:color="CCCCCC" w:sz="1"/>
-              <w:bottom w:val="single" w:color="CCCCCC" w:sz="1"/>
-              <w:right w:val="single" w:color="CCCCCC" w:sz="1"/>
-            </w:tcBorders>
-            <w:shd w:fill="F9FAFB" w:val="clear"/>
-            <w:tcMar>
-              <w:top w:type="dxa" w:w="80"/>
-              <w:left w:type="dxa" w:w="120"/>
-              <w:bottom w:type="dxa" w:w="80"/>
-              <w:right w:type="dxa" w:w="120"/>
-            </w:tcMar>
-          </w:tcPr>
-          <w:p>
-            <w:r>
-              <w:t xml:space="preserve">School Calendar</w:t>
-            </w:r>
-          </w:p>
-        </w:tc>
-        <w:tc>
-          <w:tcPr>
-            <w:tcW w:type="dxa" w:w="3120"/>
-            <w:tcBorders>
-              <w:top w:val="single" w:color="CCCCCC" w:sz="1"/>
-              <w:left w:val="single" w:color="CCCCCC" w:sz="1"/>
-              <w:bottom w:val="single" w:color="CCCCCC" w:sz="1"/>
-              <w:right w:val="single" w:color="CCCCCC" w:sz="1"/>
-            </w:tcBorders>
-            <w:shd w:fill="F9FAFB" w:val="clear"/>
-            <w:tcMar>
-              <w:top w:type="dxa" w:w="80"/>
-              <w:left w:type="dxa" w:w="120"/>
-              <w:bottom w:type="dxa" w:w="80"/>
-              <w:right w:type="dxa" w:w="120"/>
-            </w:tcMar>
-          </w:tcPr>
-          <w:p>
-            <w:r>
-              <w:t xml:space="preserve">CSV or XLSX</w:t>
-            </w:r>
-          </w:p>
-        </w:tc>
-        <w:tc>
-          <w:tcPr>
-            <w:tcW w:type="dxa" w:w="3120"/>
-            <w:tcBorders>
-              <w:top w:val="single" w:color="CCCCCC" w:sz="1"/>
-              <w:left w:val="single" w:color="CCCCCC" w:sz="1"/>
-              <w:bottom w:val="single" w:color="CCCCCC" w:sz="1"/>
-              <w:right w:val="single" w:color="CCCCCC" w:sz="1"/>
-            </w:tcBorders>
-            <w:shd w:fill="F9FAFB" w:val="clear"/>
-            <w:tcMar>
-              <w:top w:type="dxa" w:w="80"/>
-              <w:left w:type="dxa" w:w="120"/>
-              <w:bottom w:type="dxa" w:w="80"/>
-              <w:right w:type="dxa" w:w="120"/>
-            </w:tcMar>
-          </w:tcPr>
-          <w:p>
-            <w:r>
-              <w:t xml:space="preserve">Dates, holiday/break status</w:t>
-            </w:r>
-          </w:p>
-        </w:tc>
-      </w:tr>
-      <w:tr>
-        <w:tc>
-          <w:tcPr>
-            <w:tcW w:type="dxa" w:w="3120"/>
-            <w:tcBorders>
-              <w:top w:val="single" w:color="CCCCCC" w:sz="1"/>
-              <w:left w:val="single" w:color="CCCCCC" w:sz="1"/>
-              <w:bottom w:val="single" w:color="CCCCCC" w:sz="1"/>
-              <w:right w:val="single" w:color="CCCCCC" w:sz="1"/>
-            </w:tcBorders>
-            <w:shd w:fill="FFFFFF" w:val="clear"/>
-            <w:tcMar>
-              <w:top w:type="dxa" w:w="80"/>
-              <w:left w:type="dxa" w:w="120"/>
-              <w:bottom w:type="dxa" w:w="80"/>
-              <w:right w:type="dxa" w:w="120"/>
-            </w:tcMar>
-          </w:tcPr>
-          <w:p>
-            <w:r>
-              <w:t xml:space="preserve">Class Schedule</w:t>
-            </w:r>
-          </w:p>
-        </w:tc>
-        <w:tc>
-          <w:tcPr>
-            <w:tcW w:type="dxa" w:w="3120"/>
-            <w:tcBorders>
-              <w:top w:val="single" w:color="CCCCCC" w:sz="1"/>
-              <w:left w:val="single" w:color="CCCCCC" w:sz="1"/>
-              <w:bottom w:val="single" w:color="CCCCCC" w:sz="1"/>
-              <w:right w:val="single" w:color="CCCCCC" w:sz="1"/>
-            </w:tcBorders>
-            <w:shd w:fill="FFFFFF" w:val="clear"/>
-            <w:tcMar>
-              <w:top w:type="dxa" w:w="80"/>
-              <w:left w:type="dxa" w:w="120"/>
-              <w:bottom w:type="dxa" w:w="80"/>
-              <w:right w:type="dxa" w:w="120"/>
-            </w:tcMar>
-          </w:tcPr>
-          <w:p>
-            <w:r>
-              <w:t xml:space="preserve">CSV or XLSX</w:t>
-            </w:r>
-          </w:p>
-        </w:tc>
-        <w:tc>
-          <w:tcPr>
-            <w:tcW w:type="dxa" w:w="3120"/>
-            <w:tcBorders>
-              <w:top w:val="single" w:color="CCCCCC" w:sz="1"/>
-              <w:left w:val="single" w:color="CCCCCC" w:sz="1"/>
-              <w:bottom w:val="single" w:color="CCCCCC" w:sz="1"/>
-              <w:right w:val="single" w:color="CCCCCC" w:sz="1"/>
-            </w:tcBorders>
-            <w:shd w:fill="FFFFFF" w:val="clear"/>
-            <w:tcMar>
-              <w:top w:type="dxa" w:w="80"/>
-              <w:left w:type="dxa" w:w="120"/>
-              <w:bottom w:type="dxa" w:w="80"/>
-              <w:right w:type="dxa" w:w="120"/>
-            </w:tcMar>
-          </w:tcPr>
-          <w:p>
-            <w:r>
-              <w:t xml:space="preserve">Meeting days and times</w:t>
-            </w:r>
-          </w:p>
-        </w:tc>
-      </w:tr>
     </w:tbl>
     <w:p>
       <w:pPr>
@@ -2245,7 +2069,7 @@
           <w:i/>
           <w:iCs/>
         </w:rPr>
-        <w:t xml:space="preserve">💡 If parsing doesn't work: Don't worry! You can manually enter all information in Phases 3 and 4. Document upload is a time-saver, not a requirement.</w:t>
+        <w:t xml:space="preserve">💡 If parsing doesn't work: Don't worry! You can manually enter all information in Phase 3. Document upload is a time-saver, not a requirement.</w:t>
       </w:r>
     </w:p>
     <w:p>
@@ -2258,237 +2082,7 @@
           <w:b/>
           <w:bCs/>
         </w:rPr>
-        <w:t xml:space="preserve">Phase 3: Calendar &amp; Class Schedule</w:t>
-      </w:r>
-    </w:p>
-    <w:p>
-      <w:pPr>
-        <w:spacing w:after="80"/>
-      </w:pPr>
-      <w:r>
-        <w:t xml:space="preserve">Status: Required validation — At least 1 meeting day must be selected</w:t>
-      </w:r>
-    </w:p>
-    <w:p>
-      <w:pPr>
-        <w:spacing w:after="80"/>
-      </w:pPr>
-      <w:r>
-        <w:t xml:space="preserve">This phase establishes your course calendar to calculate realistic pacing by excluding holidays, breaks, and non-instructional days.</w:t>
-      </w:r>
-    </w:p>
-    <w:p>
-      <w:pPr>
-        <w:pStyle w:val="Heading3"/>
-        <w:spacing w:after="120" w:before="240"/>
-      </w:pPr>
-      <w:r>
-        <w:rPr>
-          <w:b/>
-          <w:bCs/>
-        </w:rPr>
-        <w:t xml:space="preserve">Step 1: Select Meeting Days</w:t>
-      </w:r>
-    </w:p>
-    <w:p>
-      <w:pPr>
-        <w:spacing w:after="80"/>
-      </w:pPr>
-      <w:r>
-        <w:t xml:space="preserve">Check the boxes for days your class meets:</w:t>
-      </w:r>
-    </w:p>
-    <w:p>
-      <w:pPr>
-        <w:pStyle w:val="ListParagraph"/>
-        <w:numPr>
-          <w:ilvl w:val="0"/>
-          <w:numId w:val="2"/>
-        </w:numPr>
-        <w:spacing w:after="60"/>
-      </w:pPr>
-      <w:r>
-        <w:t xml:space="preserve">☐ Monday</w:t>
-      </w:r>
-    </w:p>
-    <w:p>
-      <w:pPr>
-        <w:pStyle w:val="ListParagraph"/>
-        <w:numPr>
-          <w:ilvl w:val="0"/>
-          <w:numId w:val="2"/>
-        </w:numPr>
-        <w:spacing w:after="60"/>
-      </w:pPr>
-      <w:r>
-        <w:t xml:space="preserve">☐ Tuesday</w:t>
-      </w:r>
-    </w:p>
-    <w:p>
-      <w:pPr>
-        <w:pStyle w:val="ListParagraph"/>
-        <w:numPr>
-          <w:ilvl w:val="0"/>
-          <w:numId w:val="2"/>
-        </w:numPr>
-        <w:spacing w:after="60"/>
-      </w:pPr>
-      <w:r>
-        <w:t xml:space="preserve">☐ Wednesday</w:t>
-      </w:r>
-    </w:p>
-    <w:p>
-      <w:pPr>
-        <w:pStyle w:val="ListParagraph"/>
-        <w:numPr>
-          <w:ilvl w:val="0"/>
-          <w:numId w:val="2"/>
-        </w:numPr>
-        <w:spacing w:after="60"/>
-      </w:pPr>
-      <w:r>
-        <w:t xml:space="preserve">☐ Thursday</w:t>
-      </w:r>
-    </w:p>
-    <w:p>
-      <w:pPr>
-        <w:pStyle w:val="ListParagraph"/>
-        <w:numPr>
-          <w:ilvl w:val="0"/>
-          <w:numId w:val="2"/>
-        </w:numPr>
-        <w:spacing w:after="60"/>
-      </w:pPr>
-      <w:r>
-        <w:t xml:space="preserve">☐ Friday</w:t>
-      </w:r>
-    </w:p>
-    <w:p>
-      <w:pPr>
-        <w:spacing w:after="80"/>
-      </w:pPr>
-      <w:r>
-        <w:t xml:space="preserve">Example: If your class meets Monday, Wednesday, Friday, check only those three boxes.</w:t>
-      </w:r>
-    </w:p>
-    <w:p>
-      <w:pPr>
-        <w:pStyle w:val="Heading3"/>
-        <w:spacing w:after="120" w:before="240"/>
-      </w:pPr>
-      <w:r>
-        <w:rPr>
-          <w:b/>
-          <w:bCs/>
-        </w:rPr>
-        <w:t xml:space="preserve">Step 2: Set Class Times</w:t>
-      </w:r>
-    </w:p>
-    <w:p>
-      <w:pPr>
-        <w:pStyle w:val="ListParagraph"/>
-        <w:numPr>
-          <w:ilvl w:val="0"/>
-          <w:numId w:val="2"/>
-        </w:numPr>
-        <w:spacing w:after="60"/>
-      </w:pPr>
-      <w:r>
-        <w:t xml:space="preserve">Class Start Time: 08:00 (or 8:00 AM)</w:t>
-      </w:r>
-    </w:p>
-    <w:p>
-      <w:pPr>
-        <w:pStyle w:val="ListParagraph"/>
-        <w:numPr>
-          <w:ilvl w:val="0"/>
-          <w:numId w:val="2"/>
-        </w:numPr>
-        <w:spacing w:after="60"/>
-      </w:pPr>
-      <w:r>
-        <w:t xml:space="preserve">Class End Time: 16:00 (or 4:00 PM)</w:t>
-      </w:r>
-    </w:p>
-    <w:p>
-      <w:pPr>
-        <w:spacing w:after="80"/>
-      </w:pPr>
-      <w:r>
-        <w:t xml:space="preserve">Format: Use 24-hour time (08:00) or 12-hour (8:00 AM). Both work.</w:t>
-      </w:r>
-    </w:p>
-    <w:p>
-      <w:pPr>
-        <w:pStyle w:val="Heading3"/>
-        <w:spacing w:after="120" w:before="240"/>
-      </w:pPr>
-      <w:r>
-        <w:rPr>
-          <w:b/>
-          <w:bCs/>
-        </w:rPr>
-        <w:t xml:space="preserve">Step 3: Review &amp; Edit Holidays</w:t>
-      </w:r>
-    </w:p>
-    <w:p>
-      <w:pPr>
-        <w:spacing w:after="80"/>
-      </w:pPr>
-      <w:r>
-        <w:t xml:space="preserve">Alberta statutory holidays are automatically included. You can:</w:t>
-      </w:r>
-    </w:p>
-    <w:p>
-      <w:pPr>
-        <w:pStyle w:val="ListParagraph"/>
-        <w:numPr>
-          <w:ilvl w:val="0"/>
-          <w:numId w:val="2"/>
-        </w:numPr>
-        <w:spacing w:after="60"/>
-      </w:pPr>
-      <w:r>
-        <w:t xml:space="preserve">View pre-added holidays: Labour Day, Thanksgiving, Christmas, etc.</w:t>
-      </w:r>
-    </w:p>
-    <w:p>
-      <w:pPr>
-        <w:pStyle w:val="ListParagraph"/>
-        <w:numPr>
-          <w:ilvl w:val="0"/>
-          <w:numId w:val="2"/>
-        </w:numPr>
-        <w:spacing w:after="60"/>
-      </w:pPr>
-      <w:r>
-        <w:t xml:space="preserve">Edit dates: If a holiday falls on a weekend, you can adjust the observed date</w:t>
-      </w:r>
-    </w:p>
-    <w:p>
-      <w:pPr>
-        <w:pStyle w:val="ListParagraph"/>
-        <w:numPr>
-          <w:ilvl w:val="0"/>
-          <w:numId w:val="2"/>
-        </w:numPr>
-        <w:spacing w:after="60"/>
-      </w:pPr>
-      <w:r>
-        <w:t xml:space="preserve">Add custom holidays: Click '+ Add Holiday' to add school-specific closures</w:t>
-      </w:r>
-    </w:p>
-    <w:p>
-      <w:pPr>
-        <w:pStyle w:val="Heading2"/>
-        <w:spacing w:after="120" w:before="240"/>
-      </w:pPr>
-      <w:r>
-        <w:rPr>
-          <w:b/>
-          <w:bCs/>
-        </w:rPr>
-        <w:t xml:space="preserve">Phase 4: Curriculum &amp; Grading</w:t>
+        <w:t xml:space="preserve">Phase 3: Curriculum &amp; Grading</w:t>
       </w:r>
     </w:p>
     <w:p>
@@ -3674,7 +3268,7 @@
           <w:b/>
           <w:bCs/>
         </w:rPr>
-        <w:t xml:space="preserve">Phase 5: Review &amp; Customize</w:t>
+        <w:t xml:space="preserve">Phase 4: Review &amp; Customize</w:t>
       </w:r>
     </w:p>
     <w:p>
@@ -4187,7 +3781,7 @@
           <w:b/>
           <w:bCs/>
         </w:rPr>
-        <w:t xml:space="preserve">Phase 6: Export Your Syllabus</w:t>
+        <w:t xml:space="preserve">Phase 5: Export Your Syllabus</w:t>
       </w:r>
     </w:p>
     <w:p>
@@ -4712,7 +4306,7 @@
           <w:b/>
           <w:bCs/>
         </w:rPr>
-        <w:t xml:space="preserve">Do I have to use all 6 phases?</w:t>
+        <w:t xml:space="preserve">Do I have to use all 5 phases?</w:t>
       </w:r>
     </w:p>
     <w:p>
@@ -4759,46 +4353,33 @@
         <w:spacing w:after="60"/>
       </w:pPr>
       <w:r>
-        <w:t xml:space="preserve">Phase 3 (Calendar): Required—needed for accurate pacing</w:t>
-      </w:r>
-    </w:p>
-    <w:p>
-      <w:pPr>
-        <w:pStyle w:val="ListParagraph"/>
-        <w:numPr>
-          <w:ilvl w:val="0"/>
-          <w:numId w:val="2"/>
-        </w:numPr>
-        <w:spacing w:after="60"/>
-      </w:pPr>
-      <w:r>
-        <w:t xml:space="preserve">Phase 4 (Curriculum): Required—defines your course structure</w:t>
-      </w:r>
-    </w:p>
-    <w:p>
-      <w:pPr>
-        <w:pStyle w:val="ListParagraph"/>
-        <w:numPr>
-          <w:ilvl w:val="0"/>
-          <w:numId w:val="2"/>
-        </w:numPr>
-        <w:spacing w:after="60"/>
-      </w:pPr>
-      <w:r>
-        <w:t xml:space="preserve">Phase 5 (Review): Optional—but useful to review before export</w:t>
-      </w:r>
-    </w:p>
-    <w:p>
-      <w:pPr>
-        <w:pStyle w:val="ListParagraph"/>
-        <w:numPr>
-          <w:ilvl w:val="0"/>
-          <w:numId w:val="2"/>
-        </w:numPr>
-        <w:spacing w:after="60"/>
-      </w:pPr>
-      <w:r>
-        <w:t xml:space="preserve">Phase 6 (Export): Required—how you get your syllabus</w:t>
+        <w:t xml:space="preserve">Phase 3 (Curriculum): Required—defines your course structure</w:t>
+      </w:r>
+    </w:p>
+    <w:p>
+      <w:pPr>
+        <w:pStyle w:val="ListParagraph"/>
+        <w:numPr>
+          <w:ilvl w:val="0"/>
+          <w:numId w:val="2"/>
+        </w:numPr>
+        <w:spacing w:after="60"/>
+      </w:pPr>
+      <w:r>
+        <w:t xml:space="preserve">Phase 4 (Review): Optional—but useful to review before export</w:t>
+      </w:r>
+    </w:p>
+    <w:p>
+      <w:pPr>
+        <w:pStyle w:val="ListParagraph"/>
+        <w:numPr>
+          <w:ilvl w:val="0"/>
+          <w:numId w:val="2"/>
+        </w:numPr>
+        <w:spacing w:after="60"/>
+      </w:pPr>
+      <w:r>
+        <w:t xml:space="preserve">Phase 5 (Export): Required—how you get your syllabus</w:t>
       </w:r>
     </w:p>
     <w:p>
@@ -4884,7 +4465,7 @@
           <w:b/>
           <w:bCs/>
         </w:rPr>
-        <w:t xml:space="preserve">What if I don't have Alberta statutory holidays?</w:t>
+        <w:t xml:space="preserve">How do I share my syllabus with students?</w:t>
       </w:r>
     </w:p>
     <w:p>
@@ -4892,46 +4473,72 @@
         <w:spacing w:after="80"/>
       </w:pPr>
       <w:r>
-        <w:t xml:space="preserve">No problem! In Phase 3, you can edit or delete any holidays that don't apply:</w:t>
-      </w:r>
-    </w:p>
-    <w:p>
-      <w:pPr>
-        <w:pStyle w:val="ListParagraph"/>
-        <w:numPr>
-          <w:ilvl w:val="0"/>
-          <w:numId w:val="2"/>
-        </w:numPr>
-        <w:spacing w:after="60"/>
-      </w:pPr>
-      <w:r>
-        <w:t xml:space="preserve">Click the 'Remove' button next to any holiday you don't observe</w:t>
-      </w:r>
-    </w:p>
-    <w:p>
-      <w:pPr>
-        <w:pStyle w:val="ListParagraph"/>
-        <w:numPr>
-          <w:ilvl w:val="0"/>
-          <w:numId w:val="2"/>
-        </w:numPr>
-        <w:spacing w:after="60"/>
-      </w:pPr>
-      <w:r>
-        <w:t xml:space="preserve">Or edit the date if your school observes it on a different day</w:t>
-      </w:r>
-    </w:p>
-    <w:p>
-      <w:pPr>
-        <w:pStyle w:val="ListParagraph"/>
-        <w:numPr>
-          <w:ilvl w:val="0"/>
-          <w:numId w:val="2"/>
-        </w:numPr>
-        <w:spacing w:after="60"/>
-      </w:pPr>
-      <w:r>
-        <w:t xml:space="preserve">The pacing calculations adjust automatically</w:t>
+        <w:t xml:space="preserve">Multiple options:</w:t>
+      </w:r>
+    </w:p>
+    <w:p>
+      <w:pPr>
+        <w:pStyle w:val="ListParagraph"/>
+        <w:numPr>
+          <w:ilvl w:val="0"/>
+          <w:numId w:val="2"/>
+        </w:numPr>
+        <w:spacing w:after="60"/>
+      </w:pPr>
+      <w:r>
+        <w:t xml:space="preserve">Canvas: Upload HTML version to a Canvas page</w:t>
+      </w:r>
+    </w:p>
+    <w:p>
+      <w:pPr>
+        <w:pStyle w:val="ListParagraph"/>
+        <w:numPr>
+          <w:ilvl w:val="0"/>
+          <w:numId w:val="2"/>
+        </w:numPr>
+        <w:spacing w:after="60"/>
+      </w:pPr>
+      <w:r>
+        <w:t xml:space="preserve">Email: Send DOCX file via email</w:t>
+      </w:r>
+    </w:p>
+    <w:p>
+      <w:pPr>
+        <w:pStyle w:val="ListParagraph"/>
+        <w:numPr>
+          <w:ilvl w:val="0"/>
+          <w:numId w:val="2"/>
+        </w:numPr>
+        <w:spacing w:after="60"/>
+      </w:pPr>
+      <w:r>
+        <w:t xml:space="preserve">PDF: Print DOCX to PDF and email/share</w:t>
+      </w:r>
+    </w:p>
+    <w:p>
+      <w:pPr>
+        <w:pStyle w:val="ListParagraph"/>
+        <w:numPr>
+          <w:ilvl w:val="0"/>
+          <w:numId w:val="2"/>
+        </w:numPr>
+        <w:spacing w:after="60"/>
+      </w:pPr>
+      <w:r>
+        <w:t xml:space="preserve">Google Classroom: Upload file to assignment</w:t>
+      </w:r>
+    </w:p>
+    <w:p>
+      <w:pPr>
+        <w:pStyle w:val="ListParagraph"/>
+        <w:numPr>
+          <w:ilvl w:val="0"/>
+          <w:numId w:val="2"/>
+        </w:numPr>
+        <w:spacing w:after="60"/>
+      </w:pPr>
+      <w:r>
+        <w:t xml:space="preserve">School website: Post HTML version on your teacher page</w:t>
       </w:r>
     </w:p>
     <w:p>
@@ -4944,7 +4551,7 @@
           <w:b/>
           <w:bCs/>
         </w:rPr>
-        <w:t xml:space="preserve">How do I share my syllabus with students?</w:t>
+        <w:t xml:space="preserve">Is my data private?</w:t>
       </w:r>
     </w:p>
     <w:p>
@@ -4952,72 +4559,72 @@
         <w:spacing w:after="80"/>
       </w:pPr>
       <w:r>
-        <w:t xml:space="preserve">Multiple options:</w:t>
-      </w:r>
-    </w:p>
-    <w:p>
-      <w:pPr>
-        <w:pStyle w:val="ListParagraph"/>
-        <w:numPr>
-          <w:ilvl w:val="0"/>
-          <w:numId w:val="2"/>
-        </w:numPr>
-        <w:spacing w:after="60"/>
-      </w:pPr>
-      <w:r>
-        <w:t xml:space="preserve">Canvas: Upload HTML version to a Canvas page</w:t>
-      </w:r>
-    </w:p>
-    <w:p>
-      <w:pPr>
-        <w:pStyle w:val="ListParagraph"/>
-        <w:numPr>
-          <w:ilvl w:val="0"/>
-          <w:numId w:val="2"/>
-        </w:numPr>
-        <w:spacing w:after="60"/>
-      </w:pPr>
-      <w:r>
-        <w:t xml:space="preserve">Email: Send DOCX file via email</w:t>
-      </w:r>
-    </w:p>
-    <w:p>
-      <w:pPr>
-        <w:pStyle w:val="ListParagraph"/>
-        <w:numPr>
-          <w:ilvl w:val="0"/>
-          <w:numId w:val="2"/>
-        </w:numPr>
-        <w:spacing w:after="60"/>
-      </w:pPr>
-      <w:r>
-        <w:t xml:space="preserve">PDF: Print DOCX to PDF and email/share</w:t>
-      </w:r>
-    </w:p>
-    <w:p>
-      <w:pPr>
-        <w:pStyle w:val="ListParagraph"/>
-        <w:numPr>
-          <w:ilvl w:val="0"/>
-          <w:numId w:val="2"/>
-        </w:numPr>
-        <w:spacing w:after="60"/>
-      </w:pPr>
-      <w:r>
-        <w:t xml:space="preserve">Google Classroom: Upload file to assignment</w:t>
-      </w:r>
-    </w:p>
-    <w:p>
-      <w:pPr>
-        <w:pStyle w:val="ListParagraph"/>
-        <w:numPr>
-          <w:ilvl w:val="0"/>
-          <w:numId w:val="2"/>
-        </w:numPr>
-        <w:spacing w:after="60"/>
-      </w:pPr>
-      <w:r>
-        <w:t xml:space="preserve">School website: Post HTML version on your teacher page</w:t>
+        <w:t xml:space="preserve">Yes, completely:</w:t>
+      </w:r>
+    </w:p>
+    <w:p>
+      <w:pPr>
+        <w:pStyle w:val="ListParagraph"/>
+        <w:numPr>
+          <w:ilvl w:val="0"/>
+          <w:numId w:val="2"/>
+        </w:numPr>
+        <w:spacing w:after="60"/>
+      </w:pPr>
+      <w:r>
+        <w:t xml:space="preserve">No servers: Your data never leaves your computer</w:t>
+      </w:r>
+    </w:p>
+    <w:p>
+      <w:pPr>
+        <w:pStyle w:val="ListParagraph"/>
+        <w:numPr>
+          <w:ilvl w:val="0"/>
+          <w:numId w:val="2"/>
+        </w:numPr>
+        <w:spacing w:after="60"/>
+      </w:pPr>
+      <w:r>
+        <w:t xml:space="preserve">No accounts: You don't create an account or log in</w:t>
+      </w:r>
+    </w:p>
+    <w:p>
+      <w:pPr>
+        <w:pStyle w:val="ListParagraph"/>
+        <w:numPr>
+          <w:ilvl w:val="0"/>
+          <w:numId w:val="2"/>
+        </w:numPr>
+        <w:spacing w:after="60"/>
+      </w:pPr>
+      <w:r>
+        <w:t xml:space="preserve">No tracking: No analytics, no cookies, no data collection</w:t>
+      </w:r>
+    </w:p>
+    <w:p>
+      <w:pPr>
+        <w:pStyle w:val="ListParagraph"/>
+        <w:numPr>
+          <w:ilvl w:val="0"/>
+          <w:numId w:val="2"/>
+        </w:numPr>
+        <w:spacing w:after="60"/>
+      </w:pPr>
+      <w:r>
+        <w:t xml:space="preserve">No internet required: Works 100% offline after initial load</w:t>
+      </w:r>
+    </w:p>
+    <w:p>
+      <w:pPr>
+        <w:pStyle w:val="ListParagraph"/>
+        <w:numPr>
+          <w:ilvl w:val="0"/>
+          <w:numId w:val="2"/>
+        </w:numPr>
+        <w:spacing w:after="60"/>
+      </w:pPr>
+      <w:r>
+        <w:t xml:space="preserve">Local only: Data stored in your browser's local storage</w:t>
       </w:r>
     </w:p>
     <w:p>
@@ -5030,7 +4637,7 @@
           <w:b/>
           <w:bCs/>
         </w:rPr>
-        <w:t xml:space="preserve">Is my data private?</w:t>
+        <w:t xml:space="preserve">How do I start over with a new syllabus?</w:t>
       </w:r>
     </w:p>
     <w:p>
@@ -5038,72 +4645,63 @@
         <w:spacing w:after="80"/>
       </w:pPr>
       <w:r>
-        <w:t xml:space="preserve">Yes, completely:</w:t>
-      </w:r>
-    </w:p>
-    <w:p>
-      <w:pPr>
-        <w:pStyle w:val="ListParagraph"/>
-        <w:numPr>
-          <w:ilvl w:val="0"/>
-          <w:numId w:val="2"/>
-        </w:numPr>
-        <w:spacing w:after="60"/>
-      </w:pPr>
-      <w:r>
-        <w:t xml:space="preserve">No servers: Your data never leaves your computer</w:t>
-      </w:r>
-    </w:p>
-    <w:p>
-      <w:pPr>
-        <w:pStyle w:val="ListParagraph"/>
-        <w:numPr>
-          <w:ilvl w:val="0"/>
-          <w:numId w:val="2"/>
-        </w:numPr>
-        <w:spacing w:after="60"/>
-      </w:pPr>
-      <w:r>
-        <w:t xml:space="preserve">No accounts: You don't create an account or log in</w:t>
-      </w:r>
-    </w:p>
-    <w:p>
-      <w:pPr>
-        <w:pStyle w:val="ListParagraph"/>
-        <w:numPr>
-          <w:ilvl w:val="0"/>
-          <w:numId w:val="2"/>
-        </w:numPr>
-        <w:spacing w:after="60"/>
-      </w:pPr>
-      <w:r>
-        <w:t xml:space="preserve">No tracking: No analytics, no cookies, no data collection</w:t>
-      </w:r>
-    </w:p>
-    <w:p>
-      <w:pPr>
-        <w:pStyle w:val="ListParagraph"/>
-        <w:numPr>
-          <w:ilvl w:val="0"/>
-          <w:numId w:val="2"/>
-        </w:numPr>
-        <w:spacing w:after="60"/>
-      </w:pPr>
-      <w:r>
-        <w:t xml:space="preserve">No internet required: Works 100% offline after initial load</w:t>
-      </w:r>
-    </w:p>
-    <w:p>
-      <w:pPr>
-        <w:pStyle w:val="ListParagraph"/>
-        <w:numPr>
-          <w:ilvl w:val="0"/>
-          <w:numId w:val="2"/>
-        </w:numPr>
-        <w:spacing w:after="60"/>
-      </w:pPr>
-      <w:r>
-        <w:t xml:space="preserve">Local only: Data stored in your browser's local storage</w:t>
+        <w:t xml:space="preserve">Two options:</w:t>
+      </w:r>
+    </w:p>
+    <w:p>
+      <w:pPr>
+        <w:pStyle w:val="ListParagraph"/>
+        <w:numPr>
+          <w:ilvl w:val="0"/>
+          <w:numId w:val="2"/>
+        </w:numPr>
+        <w:spacing w:after="60"/>
+      </w:pPr>
+      <w:r>
+        <w:t xml:space="preserve">Option 1: At the end of Phase 5, click 'Start Over' button</w:t>
+      </w:r>
+    </w:p>
+    <w:p>
+      <w:pPr>
+        <w:pStyle w:val="ListParagraph"/>
+        <w:numPr>
+          <w:ilvl w:val="0"/>
+          <w:numId w:val="2"/>
+        </w:numPr>
+        <w:spacing w:after="60"/>
+      </w:pPr>
+      <w:r>
+        <w:t xml:space="preserve">Option 2: Close the browser tab and reopen the application</w:t>
+      </w:r>
+    </w:p>
+    <w:p>
+      <w:pPr>
+        <w:spacing w:after="200"/>
+      </w:pPr>
+      <w:r>
+        <w:rPr>
+          <w:b/>
+          <w:bCs/>
+        </w:rPr>
+        <w:t xml:space="preserve">⚠️ Warning: Starting over will erase your current work unless you export first!</w:t>
+      </w:r>
+    </w:p>
+    <w:p>
+      <w:r>
+        <w:br w:type="page"/>
+      </w:r>
+    </w:p>
+    <w:p>
+      <w:pPr>
+        <w:pStyle w:val="Heading1"/>
+        <w:spacing w:after="120" w:before="240"/>
+      </w:pPr>
+      <w:r>
+        <w:rPr>
+          <w:b/>
+          <w:bCs/>
+        </w:rPr>
+        <w:t xml:space="preserve">4. Troubleshooting Guide</w:t>
       </w:r>
     </w:p>
     <w:p>
@@ -5116,7 +4714,7 @@
           <w:b/>
           <w:bCs/>
         </w:rPr>
-        <w:t xml:space="preserve">How do I start over with a new syllabus?</w:t>
+        <w:t xml:space="preserve">Application won't open / blank page</w:t>
       </w:r>
     </w:p>
     <w:p>
@@ -5124,45 +4722,788 @@
         <w:spacing w:after="80"/>
       </w:pPr>
       <w:r>
-        <w:t xml:space="preserve">Two options:</w:t>
-      </w:r>
-    </w:p>
-    <w:p>
-      <w:pPr>
-        <w:pStyle w:val="ListParagraph"/>
-        <w:numPr>
-          <w:ilvl w:val="0"/>
-          <w:numId w:val="2"/>
-        </w:numPr>
-        <w:spacing w:after="60"/>
-      </w:pPr>
-      <w:r>
-        <w:t xml:space="preserve">Option 1: At the end of Phase 6, click 'Start Over' button</w:t>
-      </w:r>
-    </w:p>
-    <w:p>
-      <w:pPr>
-        <w:pStyle w:val="ListParagraph"/>
-        <w:numPr>
-          <w:ilvl w:val="0"/>
-          <w:numId w:val="2"/>
-        </w:numPr>
-        <w:spacing w:after="60"/>
-      </w:pPr>
-      <w:r>
-        <w:t xml:space="preserve">Option 2: Close the browser tab and reopen the application</w:t>
-      </w:r>
-    </w:p>
-    <w:p>
-      <w:pPr>
-        <w:spacing w:after="200"/>
+        <w:t xml:space="preserve">Problem: Click index.html but page doesn't load, or shows blank white screen</w:t>
+      </w:r>
+    </w:p>
+    <w:p>
+      <w:pPr>
+        <w:spacing w:after="80"/>
+      </w:pPr>
+      <w:r>
+        <w:t xml:space="preserve">Solutions:</w:t>
+      </w:r>
+    </w:p>
+    <w:p>
+      <w:pPr>
+        <w:pStyle w:val="ListParagraph"/>
+        <w:numPr>
+          <w:ilvl w:val="0"/>
+          <w:numId w:val="3"/>
+        </w:numPr>
+        <w:spacing w:after="60"/>
+      </w:pPr>
+      <w:r>
+        <w:t xml:space="preserve">Wait 3-5 seconds—sometimes it takes a moment to load</w:t>
+      </w:r>
+    </w:p>
+    <w:p>
+      <w:pPr>
+        <w:pStyle w:val="ListParagraph"/>
+        <w:numPr>
+          <w:ilvl w:val="0"/>
+          <w:numId w:val="3"/>
+        </w:numPr>
+        <w:spacing w:after="60"/>
+      </w:pPr>
+      <w:r>
+        <w:t xml:space="preserve">Refresh the page (F5 or Ctrl+R)</w:t>
+      </w:r>
+    </w:p>
+    <w:p>
+      <w:pPr>
+        <w:pStyle w:val="ListParagraph"/>
+        <w:numPr>
+          <w:ilvl w:val="0"/>
+          <w:numId w:val="3"/>
+        </w:numPr>
+        <w:spacing w:after="60"/>
+      </w:pPr>
+      <w:r>
+        <w:t xml:space="preserve">Try a different browser (Chrome or Edge recommended)</w:t>
+      </w:r>
+    </w:p>
+    <w:p>
+      <w:pPr>
+        <w:pStyle w:val="ListParagraph"/>
+        <w:numPr>
+          <w:ilvl w:val="0"/>
+          <w:numId w:val="3"/>
+        </w:numPr>
+        <w:spacing w:after="60"/>
+      </w:pPr>
+      <w:r>
+        <w:t xml:space="preserve">Clear browser cache and reload</w:t>
+      </w:r>
+    </w:p>
+    <w:p>
+      <w:pPr>
+        <w:pStyle w:val="ListParagraph"/>
+        <w:numPr>
+          <w:ilvl w:val="0"/>
+          <w:numId w:val="3"/>
+        </w:numPr>
+        <w:spacing w:after="60"/>
+      </w:pPr>
+      <w:r>
+        <w:t xml:space="preserve">Disable browser extensions that might block JavaScript</w:t>
+      </w:r>
+    </w:p>
+    <w:p>
+      <w:pPr>
+        <w:pStyle w:val="ListParagraph"/>
+        <w:numPr>
+          <w:ilvl w:val="0"/>
+          <w:numId w:val="3"/>
+        </w:numPr>
+        <w:spacing w:after="60"/>
+      </w:pPr>
+      <w:r>
+        <w:t xml:space="preserve">Try opening in incognito/private window</w:t>
+      </w:r>
+    </w:p>
+    <w:p>
+      <w:pPr>
+        <w:pStyle w:val="Heading2"/>
+        <w:spacing w:after="120" w:before="240"/>
       </w:pPr>
       <w:r>
         <w:rPr>
           <w:b/>
           <w:bCs/>
         </w:rPr>
-        <w:t xml:space="preserve">⚠️ Warning: Starting over will erase your current work unless you export first!</w:t>
+        <w:t xml:space="preserve">File upload not working</w:t>
+      </w:r>
+    </w:p>
+    <w:p>
+      <w:pPr>
+        <w:spacing w:after="80"/>
+      </w:pPr>
+      <w:r>
+        <w:t xml:space="preserve">Problem: Can't upload PDF, Excel, or CSV files in Phase 2</w:t>
+      </w:r>
+    </w:p>
+    <w:p>
+      <w:pPr>
+        <w:spacing w:after="80"/>
+      </w:pPr>
+      <w:r>
+        <w:t xml:space="preserve">Solutions:</w:t>
+      </w:r>
+    </w:p>
+    <w:p>
+      <w:pPr>
+        <w:pStyle w:val="ListParagraph"/>
+        <w:numPr>
+          <w:ilvl w:val="0"/>
+          <w:numId w:val="3"/>
+        </w:numPr>
+        <w:spacing w:after="60"/>
+      </w:pPr>
+      <w:r>
+        <w:t xml:space="preserve">Use a local server: Direct file access (file://) has security restrictions</w:t>
+      </w:r>
+    </w:p>
+    <w:p>
+      <w:pPr>
+        <w:pStyle w:val="ListParagraph"/>
+        <w:numPr>
+          <w:ilvl w:val="0"/>
+          <w:numId w:val="3"/>
+        </w:numPr>
+        <w:spacing w:after="60"/>
+      </w:pPr>
+      <w:r>
+        <w:t xml:space="preserve">Try dragging the file instead of clicking 'Select File'</w:t>
+      </w:r>
+    </w:p>
+    <w:p>
+      <w:pPr>
+        <w:pStyle w:val="ListParagraph"/>
+        <w:numPr>
+          <w:ilvl w:val="0"/>
+          <w:numId w:val="3"/>
+        </w:numPr>
+        <w:spacing w:after="60"/>
+      </w:pPr>
+      <w:r>
+        <w:t xml:space="preserve">Check file format—only PDF, DOCX, CSV, XLSX are supported</w:t>
+      </w:r>
+    </w:p>
+    <w:p>
+      <w:pPr>
+        <w:pStyle w:val="ListParagraph"/>
+        <w:numPr>
+          <w:ilvl w:val="0"/>
+          <w:numId w:val="3"/>
+        </w:numPr>
+        <w:spacing w:after="60"/>
+      </w:pPr>
+      <w:r>
+        <w:t xml:space="preserve">Try a different browser (Chrome works best)</w:t>
+      </w:r>
+    </w:p>
+    <w:p>
+      <w:pPr>
+        <w:pStyle w:val="ListParagraph"/>
+        <w:numPr>
+          <w:ilvl w:val="0"/>
+          <w:numId w:val="3"/>
+        </w:numPr>
+        <w:spacing w:after="60"/>
+      </w:pPr>
+      <w:r>
+        <w:t xml:space="preserve">Check file size—stay under 10 MB</w:t>
+      </w:r>
+    </w:p>
+    <w:p>
+      <w:pPr>
+        <w:pStyle w:val="ListParagraph"/>
+        <w:numPr>
+          <w:ilvl w:val="0"/>
+          <w:numId w:val="3"/>
+        </w:numPr>
+        <w:spacing w:after="60"/>
+      </w:pPr>
+      <w:r>
+        <w:t xml:space="preserve">If a PDF, make sure it's not password-protected</w:t>
+      </w:r>
+    </w:p>
+    <w:p>
+      <w:pPr>
+        <w:pStyle w:val="Heading2"/>
+        <w:spacing w:after="120" w:before="240"/>
+      </w:pPr>
+      <w:r>
+        <w:rPr>
+          <w:b/>
+          <w:bCs/>
+        </w:rPr>
+        <w:t xml:space="preserve">Can't advance to next phase</w:t>
+      </w:r>
+    </w:p>
+    <w:p>
+      <w:pPr>
+        <w:spacing w:after="80"/>
+      </w:pPr>
+      <w:r>
+        <w:t xml:space="preserve">Problem: 'Next →' button is disabled or shows error message</w:t>
+      </w:r>
+    </w:p>
+    <w:p>
+      <w:pPr>
+        <w:spacing w:after="80"/>
+      </w:pPr>
+      <w:r>
+        <w:t xml:space="preserve">Solutions:</w:t>
+      </w:r>
+    </w:p>
+    <w:p>
+      <w:pPr>
+        <w:pStyle w:val="ListParagraph"/>
+        <w:numPr>
+          <w:ilvl w:val="0"/>
+          <w:numId w:val="3"/>
+        </w:numPr>
+        <w:spacing w:after="60"/>
+      </w:pPr>
+      <w:r>
+        <w:t xml:space="preserve">Check for error message: It tells you what's required</w:t>
+      </w:r>
+    </w:p>
+    <w:p>
+      <w:pPr>
+        <w:pStyle w:val="ListParagraph"/>
+        <w:numPr>
+          <w:ilvl w:val="0"/>
+          <w:numId w:val="3"/>
+        </w:numPr>
+        <w:spacing w:after="60"/>
+      </w:pPr>
+      <w:r>
+        <w:t xml:space="preserve">Phase 1: Make sure all fields marked with * are filled in</w:t>
+      </w:r>
+    </w:p>
+    <w:p>
+      <w:pPr>
+        <w:pStyle w:val="ListParagraph"/>
+        <w:numPr>
+          <w:ilvl w:val="0"/>
+          <w:numId w:val="3"/>
+        </w:numPr>
+        <w:spacing w:after="60"/>
+      </w:pPr>
+      <w:r>
+        <w:t xml:space="preserve">Phase 3: Units must total exactly 100%, grades must total 100%</w:t>
+      </w:r>
+    </w:p>
+    <w:p>
+      <w:pPr>
+        <w:pStyle w:val="ListParagraph"/>
+        <w:numPr>
+          <w:ilvl w:val="0"/>
+          <w:numId w:val="3"/>
+        </w:numPr>
+        <w:spacing w:after="60"/>
+      </w:pPr>
+      <w:r>
+        <w:t xml:space="preserve">Try refreshing the page (F5)</w:t>
+      </w:r>
+    </w:p>
+    <w:p>
+      <w:pPr>
+        <w:pStyle w:val="ListParagraph"/>
+        <w:numPr>
+          <w:ilvl w:val="0"/>
+          <w:numId w:val="3"/>
+        </w:numPr>
+        <w:spacing w:after="60"/>
+      </w:pPr>
+      <w:r>
+        <w:t xml:space="preserve">Go back to previous phase and then forward again</w:t>
+      </w:r>
+    </w:p>
+    <w:p>
+      <w:pPr>
+        <w:pStyle w:val="Heading2"/>
+        <w:spacing w:after="120" w:before="240"/>
+      </w:pPr>
+      <w:r>
+        <w:rPr>
+          <w:b/>
+          <w:bCs/>
+        </w:rPr>
+        <w:t xml:space="preserve">Data disappeared / lost all my work</w:t>
+      </w:r>
+    </w:p>
+    <w:p>
+      <w:pPr>
+        <w:spacing w:after="80"/>
+      </w:pPr>
+      <w:r>
+        <w:t xml:space="preserve">Problem: You had filled in Phase 1-3, but now everything is gone</w:t>
+      </w:r>
+    </w:p>
+    <w:p>
+      <w:pPr>
+        <w:spacing w:after="80"/>
+      </w:pPr>
+      <w:r>
+        <w:t xml:space="preserve">Likely Cause: Browser cache was cleared</w:t>
+      </w:r>
+    </w:p>
+    <w:p>
+      <w:pPr>
+        <w:spacing w:after="80"/>
+      </w:pPr>
+      <w:r>
+        <w:t xml:space="preserve">Solutions:</w:t>
+      </w:r>
+    </w:p>
+    <w:p>
+      <w:pPr>
+        <w:pStyle w:val="ListParagraph"/>
+        <w:numPr>
+          <w:ilvl w:val="0"/>
+          <w:numId w:val="3"/>
+        </w:numPr>
+        <w:spacing w:after="60"/>
+      </w:pPr>
+      <w:r>
+        <w:t xml:space="preserve">Check if it's a different browser: Each browser has separate storage</w:t>
+      </w:r>
+    </w:p>
+    <w:p>
+      <w:pPr>
+        <w:pStyle w:val="ListParagraph"/>
+        <w:numPr>
+          <w:ilvl w:val="0"/>
+          <w:numId w:val="3"/>
+        </w:numPr>
+        <w:spacing w:after="60"/>
+      </w:pPr>
+      <w:r>
+        <w:t xml:space="preserve">Export more frequently: After each phase, export a backup</w:t>
+      </w:r>
+    </w:p>
+    <w:p>
+      <w:pPr>
+        <w:pStyle w:val="ListParagraph"/>
+        <w:numPr>
+          <w:ilvl w:val="0"/>
+          <w:numId w:val="3"/>
+        </w:numPr>
+        <w:spacing w:after="60"/>
+      </w:pPr>
+      <w:r>
+        <w:t xml:space="preserve">If you exported before losing data: You can manually re-enter from the backup</w:t>
+      </w:r>
+    </w:p>
+    <w:p>
+      <w:pPr>
+        <w:pStyle w:val="ListParagraph"/>
+        <w:numPr>
+          <w:ilvl w:val="0"/>
+          <w:numId w:val="3"/>
+        </w:numPr>
+        <w:spacing w:after="60"/>
+      </w:pPr>
+      <w:r>
+        <w:t xml:space="preserve">Use the same browser and don't clear cache while working</w:t>
+      </w:r>
+    </w:p>
+    <w:p>
+      <w:pPr>
+        <w:pStyle w:val="Heading2"/>
+        <w:spacing w:after="120" w:before="240"/>
+      </w:pPr>
+      <w:r>
+        <w:rPr>
+          <w:b/>
+          <w:bCs/>
+        </w:rPr>
+        <w:t xml:space="preserve">Export button not working</w:t>
+      </w:r>
+    </w:p>
+    <w:p>
+      <w:pPr>
+        <w:spacing w:after="80"/>
+      </w:pPr>
+      <w:r>
+        <w:t xml:space="preserve">Problem: Click export option but nothing happens or download fails</w:t>
+      </w:r>
+    </w:p>
+    <w:p>
+      <w:pPr>
+        <w:spacing w:after="80"/>
+      </w:pPr>
+      <w:r>
+        <w:t xml:space="preserve">Solutions:</w:t>
+      </w:r>
+    </w:p>
+    <w:p>
+      <w:pPr>
+        <w:pStyle w:val="ListParagraph"/>
+        <w:numPr>
+          <w:ilvl w:val="0"/>
+          <w:numId w:val="3"/>
+        </w:numPr>
+        <w:spacing w:after="60"/>
+      </w:pPr>
+      <w:r>
+        <w:t xml:space="preserve">Check your browser's download settings—downloads may be blocked</w:t>
+      </w:r>
+    </w:p>
+    <w:p>
+      <w:pPr>
+        <w:pStyle w:val="ListParagraph"/>
+        <w:numPr>
+          <w:ilvl w:val="0"/>
+          <w:numId w:val="3"/>
+        </w:numPr>
+        <w:spacing w:after="60"/>
+      </w:pPr>
+      <w:r>
+        <w:t xml:space="preserve">Look for a yellow notification bar at the top of browser</w:t>
+      </w:r>
+    </w:p>
+    <w:p>
+      <w:pPr>
+        <w:pStyle w:val="ListParagraph"/>
+        <w:numPr>
+          <w:ilvl w:val="0"/>
+          <w:numId w:val="3"/>
+        </w:numPr>
+        <w:spacing w:after="60"/>
+      </w:pPr>
+      <w:r>
+        <w:t xml:space="preserve">Allow downloads for this website in browser settings</w:t>
+      </w:r>
+    </w:p>
+    <w:p>
+      <w:pPr>
+        <w:pStyle w:val="ListParagraph"/>
+        <w:numPr>
+          <w:ilvl w:val="0"/>
+          <w:numId w:val="3"/>
+        </w:numPr>
+        <w:spacing w:after="60"/>
+      </w:pPr>
+      <w:r>
+        <w:t xml:space="preserve">Try a different browser</w:t>
+      </w:r>
+    </w:p>
+    <w:p>
+      <w:pPr>
+        <w:pStyle w:val="ListParagraph"/>
+        <w:numPr>
+          <w:ilvl w:val="0"/>
+          <w:numId w:val="3"/>
+        </w:numPr>
+        <w:spacing w:after="60"/>
+      </w:pPr>
+      <w:r>
+        <w:t xml:space="preserve">Try a different export format (HTML instead of DOCX)</w:t>
+      </w:r>
+    </w:p>
+    <w:p>
+      <w:pPr>
+        <w:pStyle w:val="ListParagraph"/>
+        <w:numPr>
+          <w:ilvl w:val="0"/>
+          <w:numId w:val="3"/>
+        </w:numPr>
+        <w:spacing w:after="60"/>
+      </w:pPr>
+      <w:r>
+        <w:t xml:space="preserve">Make sure you have enough disk space</w:t>
+      </w:r>
+    </w:p>
+    <w:p>
+      <w:pPr>
+        <w:pStyle w:val="ListParagraph"/>
+        <w:numPr>
+          <w:ilvl w:val="0"/>
+          <w:numId w:val="3"/>
+        </w:numPr>
+        <w:spacing w:after="60"/>
+      </w:pPr>
+      <w:r>
+        <w:t xml:space="preserve">Check if a popup blocker is preventing download dialog</w:t>
+      </w:r>
+    </w:p>
+    <w:p>
+      <w:pPr>
+        <w:pStyle w:val="Heading2"/>
+        <w:spacing w:after="120" w:before="240"/>
+      </w:pPr>
+      <w:r>
+        <w:rPr>
+          <w:b/>
+          <w:bCs/>
+        </w:rPr>
+        <w:t xml:space="preserve">DOCX file won't open / corrupted</w:t>
+      </w:r>
+    </w:p>
+    <w:p>
+      <w:pPr>
+        <w:spacing w:after="80"/>
+      </w:pPr>
+      <w:r>
+        <w:t xml:space="preserve">Problem: Downloaded DOCX file, but Word says it's corrupted</w:t>
+      </w:r>
+    </w:p>
+    <w:p>
+      <w:pPr>
+        <w:spacing w:after="80"/>
+      </w:pPr>
+      <w:r>
+        <w:t xml:space="preserve">Solutions:</w:t>
+      </w:r>
+    </w:p>
+    <w:p>
+      <w:pPr>
+        <w:pStyle w:val="ListParagraph"/>
+        <w:numPr>
+          <w:ilvl w:val="0"/>
+          <w:numId w:val="3"/>
+        </w:numPr>
+        <w:spacing w:after="60"/>
+      </w:pPr>
+      <w:r>
+        <w:t xml:space="preserve">Try opening in Google Docs instead (usually more forgiving)</w:t>
+      </w:r>
+    </w:p>
+    <w:p>
+      <w:pPr>
+        <w:pStyle w:val="ListParagraph"/>
+        <w:numPr>
+          <w:ilvl w:val="0"/>
+          <w:numId w:val="3"/>
+        </w:numPr>
+        <w:spacing w:after="60"/>
+      </w:pPr>
+      <w:r>
+        <w:t xml:space="preserve">Try HTML export instead—save as PDF from browser</w:t>
+      </w:r>
+    </w:p>
+    <w:p>
+      <w:pPr>
+        <w:pStyle w:val="ListParagraph"/>
+        <w:numPr>
+          <w:ilvl w:val="0"/>
+          <w:numId w:val="3"/>
+        </w:numPr>
+        <w:spacing w:after="60"/>
+      </w:pPr>
+      <w:r>
+        <w:t xml:space="preserve">Re-export the DOCX file (may have been incomplete download)</w:t>
+      </w:r>
+    </w:p>
+    <w:p>
+      <w:pPr>
+        <w:pStyle w:val="ListParagraph"/>
+        <w:numPr>
+          <w:ilvl w:val="0"/>
+          <w:numId w:val="3"/>
+        </w:numPr>
+        <w:spacing w:after="60"/>
+      </w:pPr>
+      <w:r>
+        <w:t xml:space="preserve">Check Downloads folder—file may not have fully downloaded</w:t>
+      </w:r>
+    </w:p>
+    <w:p>
+      <w:pPr>
+        <w:pStyle w:val="ListParagraph"/>
+        <w:numPr>
+          <w:ilvl w:val="0"/>
+          <w:numId w:val="3"/>
+        </w:numPr>
+        <w:spacing w:after="60"/>
+      </w:pPr>
+      <w:r>
+        <w:t xml:space="preserve">Try different browser to export (Chrome or Edge)</w:t>
+      </w:r>
+    </w:p>
+    <w:p>
+      <w:pPr>
+        <w:pStyle w:val="Heading2"/>
+        <w:spacing w:after="120" w:before="240"/>
+      </w:pPr>
+      <w:r>
+        <w:rPr>
+          <w:b/>
+          <w:bCs/>
+        </w:rPr>
+        <w:t xml:space="preserve">Canvas paste not working</w:t>
+      </w:r>
+    </w:p>
+    <w:p>
+      <w:pPr>
+        <w:spacing w:after="80"/>
+      </w:pPr>
+      <w:r>
+        <w:t xml:space="preserve">Problem: Exported HTML and tried to paste into Canvas, but formatting is broken</w:t>
+      </w:r>
+    </w:p>
+    <w:p>
+      <w:pPr>
+        <w:spacing w:after="80"/>
+      </w:pPr>
+      <w:r>
+        <w:t xml:space="preserve">Solutions:</w:t>
+      </w:r>
+    </w:p>
+    <w:p>
+      <w:pPr>
+        <w:pStyle w:val="ListParagraph"/>
+        <w:numPr>
+          <w:ilvl w:val="0"/>
+          <w:numId w:val="3"/>
+        </w:numPr>
+        <w:spacing w:after="60"/>
+      </w:pPr>
+      <w:r>
+        <w:t xml:space="preserve">Use Canvas HTML editor: Click 'Edit Page' → HTML Editor (not Rich Content Editor)</w:t>
+      </w:r>
+    </w:p>
+    <w:p>
+      <w:pPr>
+        <w:pStyle w:val="ListParagraph"/>
+        <w:numPr>
+          <w:ilvl w:val="0"/>
+          <w:numId w:val="3"/>
+        </w:numPr>
+        <w:spacing w:after="60"/>
+      </w:pPr>
+      <w:r>
+        <w:t xml:space="preserve">Clear formatting: In Canvas, use 'Remove Formatting' before pasting</w:t>
+      </w:r>
+    </w:p>
+    <w:p>
+      <w:pPr>
+        <w:pStyle w:val="ListParagraph"/>
+        <w:numPr>
+          <w:ilvl w:val="0"/>
+          <w:numId w:val="3"/>
+        </w:numPr>
+        <w:spacing w:after="60"/>
+      </w:pPr>
+      <w:r>
+        <w:t xml:space="preserve">Copy whole HTML: Make sure you copied entire HTML file content</w:t>
+      </w:r>
+    </w:p>
+    <w:p>
+      <w:pPr>
+        <w:pStyle w:val="ListParagraph"/>
+        <w:numPr>
+          <w:ilvl w:val="0"/>
+          <w:numId w:val="3"/>
+        </w:numPr>
+        <w:spacing w:after="60"/>
+      </w:pPr>
+      <w:r>
+        <w:t xml:space="preserve">Try as link instead: Save HTML file and link to it</w:t>
+      </w:r>
+    </w:p>
+    <w:p>
+      <w:pPr>
+        <w:pStyle w:val="ListParagraph"/>
+        <w:numPr>
+          <w:ilvl w:val="0"/>
+          <w:numId w:val="3"/>
+        </w:numPr>
+        <w:spacing w:after="60"/>
+      </w:pPr>
+      <w:r>
+        <w:t xml:space="preserve">Use DOCX instead: Export as DOCX, open in Word, copy section by section</w:t>
+      </w:r>
+    </w:p>
+    <w:p>
+      <w:pPr>
+        <w:pStyle w:val="Heading2"/>
+        <w:spacing w:after="120" w:before="240"/>
+      </w:pPr>
+      <w:r>
+        <w:rPr>
+          <w:b/>
+          <w:bCs/>
+        </w:rPr>
+        <w:t xml:space="preserve">Pacing guide weeks look wrong</w:t>
+      </w:r>
+    </w:p>
+    <w:p>
+      <w:pPr>
+        <w:spacing w:after="80"/>
+      </w:pPr>
+      <w:r>
+        <w:t xml:space="preserve">Problem: The CSV pacing guide's start/end weeks don't match your actual calendar</w:t>
+      </w:r>
+    </w:p>
+    <w:p>
+      <w:pPr>
+        <w:spacing w:after="80"/>
+      </w:pPr>
+      <w:r>
+        <w:t xml:space="preserve">Solutions:</w:t>
+      </w:r>
+    </w:p>
+    <w:p>
+      <w:pPr>
+        <w:pStyle w:val="ListParagraph"/>
+        <w:numPr>
+          <w:ilvl w:val="0"/>
+          <w:numId w:val="3"/>
+        </w:numPr>
+        <w:spacing w:after="60"/>
+      </w:pPr>
+      <w:r>
+        <w:t xml:space="preserve">Check your start and end dates in Phase 1—make sure they're correct</w:t>
+      </w:r>
+    </w:p>
+    <w:p>
+      <w:pPr>
+        <w:pStyle w:val="ListParagraph"/>
+        <w:numPr>
+          <w:ilvl w:val="0"/>
+          <w:numId w:val="3"/>
+        </w:numPr>
+        <w:spacing w:after="60"/>
+      </w:pPr>
+      <w:r>
+        <w:t xml:space="preserve">Since this generator doesn't track a class calendar or holidays, you're responsible for accounting for breaks and non-instructional time when estimating each unit's weeks</w:t>
+      </w:r>
+    </w:p>
+    <w:p>
+      <w:pPr>
+        <w:pStyle w:val="ListParagraph"/>
+        <w:numPr>
+          <w:ilvl w:val="0"/>
+          <w:numId w:val="3"/>
+        </w:numPr>
+        <w:spacing w:after="60"/>
+      </w:pPr>
+      <w:r>
+        <w:t xml:space="preserve">Pacing is based on the 'Weeks (Est.)' value you set for each unit in Phase 3—adjust it there if a unit needs more or less time</w:t>
+      </w:r>
+    </w:p>
+    <w:p>
+      <w:pPr>
+        <w:pStyle w:val="Heading2"/>
+        <w:spacing w:after="120" w:before="240"/>
+      </w:pPr>
+      <w:r>
+        <w:rPr>
+          <w:b/>
+          <w:bCs/>
+        </w:rPr>
+        <w:t xml:space="preserve">Browser back button goes away from app</w:t>
+      </w:r>
+    </w:p>
+    <w:p>
+      <w:pPr>
+        <w:spacing w:after="80"/>
+      </w:pPr>
+      <w:r>
+        <w:t xml:space="preserve">Problem: Clicking browser back button closes the app instead of going back a phase</w:t>
+      </w:r>
+    </w:p>
+    <w:p>
+      <w:pPr>
+        <w:spacing w:after="80"/>
+      </w:pPr>
+      <w:r>
+        <w:t xml:space="preserve">Solution: Always use the app's '← Back' button inside the form, not your browser's back button.</w:t>
       </w:r>
     </w:p>
     <w:p>
@@ -5180,7 +5521,7 @@
           <w:b/>
           <w:bCs/>
         </w:rPr>
-        <w:t xml:space="preserve">4. Troubleshooting Guide</w:t>
+        <w:t xml:space="preserve">5. Best Practices &amp; Professional Tips</w:t>
       </w:r>
     </w:p>
     <w:p>
@@ -5193,7 +5534,7 @@
           <w:b/>
           <w:bCs/>
         </w:rPr>
-        <w:t xml:space="preserve">Application won't open / blank page</w:t>
+        <w:t xml:space="preserve">Tip 1: Start with your planning documents</w:t>
       </w:r>
     </w:p>
     <w:p>
@@ -5201,7 +5542,33 @@
         <w:spacing w:after="80"/>
       </w:pPr>
       <w:r>
-        <w:t xml:space="preserve">Problem: Click index.html but page doesn't load, or shows blank white screen</w:t>
+        <w:t xml:space="preserve">Before opening the app, gather:</w:t>
+      </w:r>
+    </w:p>
+    <w:p>
+      <w:pPr>
+        <w:pStyle w:val="ListParagraph"/>
+        <w:numPr>
+          <w:ilvl w:val="0"/>
+          <w:numId w:val="2"/>
+        </w:numPr>
+        <w:spacing w:after="60"/>
+      </w:pPr>
+      <w:r>
+        <w:t xml:space="preserve">Your program of studies (PDF or curriculum document)</w:t>
+      </w:r>
+    </w:p>
+    <w:p>
+      <w:pPr>
+        <w:pStyle w:val="ListParagraph"/>
+        <w:numPr>
+          <w:ilvl w:val="0"/>
+          <w:numId w:val="2"/>
+        </w:numPr>
+        <w:spacing w:after="60"/>
+      </w:pPr>
+      <w:r>
+        <w:t xml:space="preserve">Your grading rubric or existing syllabus</w:t>
       </w:r>
     </w:p>
     <w:p>
@@ -5209,918 +5576,7 @@
         <w:spacing w:after="80"/>
       </w:pPr>
       <w:r>
-        <w:t xml:space="preserve">Solutions:</w:t>
-      </w:r>
-    </w:p>
-    <w:p>
-      <w:pPr>
-        <w:pStyle w:val="ListParagraph"/>
-        <w:numPr>
-          <w:ilvl w:val="0"/>
-          <w:numId w:val="3"/>
-        </w:numPr>
-        <w:spacing w:after="60"/>
-      </w:pPr>
-      <w:r>
-        <w:t xml:space="preserve">Wait 3-5 seconds—sometimes it takes a moment to load</w:t>
-      </w:r>
-    </w:p>
-    <w:p>
-      <w:pPr>
-        <w:pStyle w:val="ListParagraph"/>
-        <w:numPr>
-          <w:ilvl w:val="0"/>
-          <w:numId w:val="3"/>
-        </w:numPr>
-        <w:spacing w:after="60"/>
-      </w:pPr>
-      <w:r>
-        <w:t xml:space="preserve">Refresh the page (F5 or Ctrl+R)</w:t>
-      </w:r>
-    </w:p>
-    <w:p>
-      <w:pPr>
-        <w:pStyle w:val="ListParagraph"/>
-        <w:numPr>
-          <w:ilvl w:val="0"/>
-          <w:numId w:val="3"/>
-        </w:numPr>
-        <w:spacing w:after="60"/>
-      </w:pPr>
-      <w:r>
-        <w:t xml:space="preserve">Try a different browser (Chrome or Edge recommended)</w:t>
-      </w:r>
-    </w:p>
-    <w:p>
-      <w:pPr>
-        <w:pStyle w:val="ListParagraph"/>
-        <w:numPr>
-          <w:ilvl w:val="0"/>
-          <w:numId w:val="3"/>
-        </w:numPr>
-        <w:spacing w:after="60"/>
-      </w:pPr>
-      <w:r>
-        <w:t xml:space="preserve">Clear browser cache and reload</w:t>
-      </w:r>
-    </w:p>
-    <w:p>
-      <w:pPr>
-        <w:pStyle w:val="ListParagraph"/>
-        <w:numPr>
-          <w:ilvl w:val="0"/>
-          <w:numId w:val="3"/>
-        </w:numPr>
-        <w:spacing w:after="60"/>
-      </w:pPr>
-      <w:r>
-        <w:t xml:space="preserve">Disable browser extensions that might block JavaScript</w:t>
-      </w:r>
-    </w:p>
-    <w:p>
-      <w:pPr>
-        <w:pStyle w:val="ListParagraph"/>
-        <w:numPr>
-          <w:ilvl w:val="0"/>
-          <w:numId w:val="3"/>
-        </w:numPr>
-        <w:spacing w:after="60"/>
-      </w:pPr>
-      <w:r>
-        <w:t xml:space="preserve">Try opening in incognito/private window</w:t>
-      </w:r>
-    </w:p>
-    <w:p>
-      <w:pPr>
-        <w:pStyle w:val="Heading2"/>
-        <w:spacing w:after="120" w:before="240"/>
-      </w:pPr>
-      <w:r>
-        <w:rPr>
-          <w:b/>
-          <w:bCs/>
-        </w:rPr>
-        <w:t xml:space="preserve">File upload not working</w:t>
-      </w:r>
-    </w:p>
-    <w:p>
-      <w:pPr>
-        <w:spacing w:after="80"/>
-      </w:pPr>
-      <w:r>
-        <w:t xml:space="preserve">Problem: Can't upload PDF, Excel, or CSV files in Phase 2</w:t>
-      </w:r>
-    </w:p>
-    <w:p>
-      <w:pPr>
-        <w:spacing w:after="80"/>
-      </w:pPr>
-      <w:r>
-        <w:t xml:space="preserve">Solutions:</w:t>
-      </w:r>
-    </w:p>
-    <w:p>
-      <w:pPr>
-        <w:pStyle w:val="ListParagraph"/>
-        <w:numPr>
-          <w:ilvl w:val="0"/>
-          <w:numId w:val="3"/>
-        </w:numPr>
-        <w:spacing w:after="60"/>
-      </w:pPr>
-      <w:r>
-        <w:t xml:space="preserve">Use a local server: Direct file access (file://) has security restrictions</w:t>
-      </w:r>
-    </w:p>
-    <w:p>
-      <w:pPr>
-        <w:pStyle w:val="ListParagraph"/>
-        <w:numPr>
-          <w:ilvl w:val="0"/>
-          <w:numId w:val="3"/>
-        </w:numPr>
-        <w:spacing w:after="60"/>
-      </w:pPr>
-      <w:r>
-        <w:t xml:space="preserve">Try dragging the file instead of clicking 'Select File'</w:t>
-      </w:r>
-    </w:p>
-    <w:p>
-      <w:pPr>
-        <w:pStyle w:val="ListParagraph"/>
-        <w:numPr>
-          <w:ilvl w:val="0"/>
-          <w:numId w:val="3"/>
-        </w:numPr>
-        <w:spacing w:after="60"/>
-      </w:pPr>
-      <w:r>
-        <w:t xml:space="preserve">Check file format—only PDF, DOCX, CSV, XLSX are supported</w:t>
-      </w:r>
-    </w:p>
-    <w:p>
-      <w:pPr>
-        <w:pStyle w:val="ListParagraph"/>
-        <w:numPr>
-          <w:ilvl w:val="0"/>
-          <w:numId w:val="3"/>
-        </w:numPr>
-        <w:spacing w:after="60"/>
-      </w:pPr>
-      <w:r>
-        <w:t xml:space="preserve">Try a different browser (Chrome works best)</w:t>
-      </w:r>
-    </w:p>
-    <w:p>
-      <w:pPr>
-        <w:pStyle w:val="ListParagraph"/>
-        <w:numPr>
-          <w:ilvl w:val="0"/>
-          <w:numId w:val="3"/>
-        </w:numPr>
-        <w:spacing w:after="60"/>
-      </w:pPr>
-      <w:r>
-        <w:t xml:space="preserve">Check file size—stay under 10 MB</w:t>
-      </w:r>
-    </w:p>
-    <w:p>
-      <w:pPr>
-        <w:pStyle w:val="ListParagraph"/>
-        <w:numPr>
-          <w:ilvl w:val="0"/>
-          <w:numId w:val="3"/>
-        </w:numPr>
-        <w:spacing w:after="60"/>
-      </w:pPr>
-      <w:r>
-        <w:t xml:space="preserve">If a PDF, make sure it's not password-protected</w:t>
-      </w:r>
-    </w:p>
-    <w:p>
-      <w:pPr>
-        <w:pStyle w:val="Heading2"/>
-        <w:spacing w:after="120" w:before="240"/>
-      </w:pPr>
-      <w:r>
-        <w:rPr>
-          <w:b/>
-          <w:bCs/>
-        </w:rPr>
-        <w:t xml:space="preserve">Can't advance to next phase</w:t>
-      </w:r>
-    </w:p>
-    <w:p>
-      <w:pPr>
-        <w:spacing w:after="80"/>
-      </w:pPr>
-      <w:r>
-        <w:t xml:space="preserve">Problem: 'Next →' button is disabled or shows error message</w:t>
-      </w:r>
-    </w:p>
-    <w:p>
-      <w:pPr>
-        <w:spacing w:after="80"/>
-      </w:pPr>
-      <w:r>
-        <w:t xml:space="preserve">Solutions:</w:t>
-      </w:r>
-    </w:p>
-    <w:p>
-      <w:pPr>
-        <w:pStyle w:val="ListParagraph"/>
-        <w:numPr>
-          <w:ilvl w:val="0"/>
-          <w:numId w:val="3"/>
-        </w:numPr>
-        <w:spacing w:after="60"/>
-      </w:pPr>
-      <w:r>
-        <w:t xml:space="preserve">Check for error message: It tells you what's required</w:t>
-      </w:r>
-    </w:p>
-    <w:p>
-      <w:pPr>
-        <w:pStyle w:val="ListParagraph"/>
-        <w:numPr>
-          <w:ilvl w:val="0"/>
-          <w:numId w:val="3"/>
-        </w:numPr>
-        <w:spacing w:after="60"/>
-      </w:pPr>
-      <w:r>
-        <w:t xml:space="preserve">Phase 1: Make sure all fields marked with * are filled in</w:t>
-      </w:r>
-    </w:p>
-    <w:p>
-      <w:pPr>
-        <w:pStyle w:val="ListParagraph"/>
-        <w:numPr>
-          <w:ilvl w:val="0"/>
-          <w:numId w:val="3"/>
-        </w:numPr>
-        <w:spacing w:after="60"/>
-      </w:pPr>
-      <w:r>
-        <w:t xml:space="preserve">Phase 3: Select at least one meeting day (M–F checkbox)</w:t>
-      </w:r>
-    </w:p>
-    <w:p>
-      <w:pPr>
-        <w:pStyle w:val="ListParagraph"/>
-        <w:numPr>
-          <w:ilvl w:val="0"/>
-          <w:numId w:val="3"/>
-        </w:numPr>
-        <w:spacing w:after="60"/>
-      </w:pPr>
-      <w:r>
-        <w:t xml:space="preserve">Phase 4: Units must total exactly 100%, grades must total 100%</w:t>
-      </w:r>
-    </w:p>
-    <w:p>
-      <w:pPr>
-        <w:pStyle w:val="ListParagraph"/>
-        <w:numPr>
-          <w:ilvl w:val="0"/>
-          <w:numId w:val="3"/>
-        </w:numPr>
-        <w:spacing w:after="60"/>
-      </w:pPr>
-      <w:r>
-        <w:t xml:space="preserve">Try refreshing the page (F5)</w:t>
-      </w:r>
-    </w:p>
-    <w:p>
-      <w:pPr>
-        <w:pStyle w:val="ListParagraph"/>
-        <w:numPr>
-          <w:ilvl w:val="0"/>
-          <w:numId w:val="3"/>
-        </w:numPr>
-        <w:spacing w:after="60"/>
-      </w:pPr>
-      <w:r>
-        <w:t xml:space="preserve">Go back to previous phase and then forward again</w:t>
-      </w:r>
-    </w:p>
-    <w:p>
-      <w:pPr>
-        <w:pStyle w:val="Heading2"/>
-        <w:spacing w:after="120" w:before="240"/>
-      </w:pPr>
-      <w:r>
-        <w:rPr>
-          <w:b/>
-          <w:bCs/>
-        </w:rPr>
-        <w:t xml:space="preserve">Data disappeared / lost all my work</w:t>
-      </w:r>
-    </w:p>
-    <w:p>
-      <w:pPr>
-        <w:spacing w:after="80"/>
-      </w:pPr>
-      <w:r>
-        <w:t xml:space="preserve">Problem: You had filled in Phase 1-3, but now everything is gone</w:t>
-      </w:r>
-    </w:p>
-    <w:p>
-      <w:pPr>
-        <w:spacing w:after="80"/>
-      </w:pPr>
-      <w:r>
-        <w:t xml:space="preserve">Likely Cause: Browser cache was cleared</w:t>
-      </w:r>
-    </w:p>
-    <w:p>
-      <w:pPr>
-        <w:spacing w:after="80"/>
-      </w:pPr>
-      <w:r>
-        <w:t xml:space="preserve">Solutions:</w:t>
-      </w:r>
-    </w:p>
-    <w:p>
-      <w:pPr>
-        <w:pStyle w:val="ListParagraph"/>
-        <w:numPr>
-          <w:ilvl w:val="0"/>
-          <w:numId w:val="3"/>
-        </w:numPr>
-        <w:spacing w:after="60"/>
-      </w:pPr>
-      <w:r>
-        <w:t xml:space="preserve">Check if it's a different browser: Each browser has separate storage</w:t>
-      </w:r>
-    </w:p>
-    <w:p>
-      <w:pPr>
-        <w:pStyle w:val="ListParagraph"/>
-        <w:numPr>
-          <w:ilvl w:val="0"/>
-          <w:numId w:val="3"/>
-        </w:numPr>
-        <w:spacing w:after="60"/>
-      </w:pPr>
-      <w:r>
-        <w:t xml:space="preserve">Export more frequently: After each phase, export a backup</w:t>
-      </w:r>
-    </w:p>
-    <w:p>
-      <w:pPr>
-        <w:pStyle w:val="ListParagraph"/>
-        <w:numPr>
-          <w:ilvl w:val="0"/>
-          <w:numId w:val="3"/>
-        </w:numPr>
-        <w:spacing w:after="60"/>
-      </w:pPr>
-      <w:r>
-        <w:t xml:space="preserve">If you exported before losing data: You can manually re-enter from the backup</w:t>
-      </w:r>
-    </w:p>
-    <w:p>
-      <w:pPr>
-        <w:pStyle w:val="ListParagraph"/>
-        <w:numPr>
-          <w:ilvl w:val="0"/>
-          <w:numId w:val="3"/>
-        </w:numPr>
-        <w:spacing w:after="60"/>
-      </w:pPr>
-      <w:r>
-        <w:t xml:space="preserve">Use the same browser and don't clear cache while working</w:t>
-      </w:r>
-    </w:p>
-    <w:p>
-      <w:pPr>
-        <w:pStyle w:val="Heading2"/>
-        <w:spacing w:after="120" w:before="240"/>
-      </w:pPr>
-      <w:r>
-        <w:rPr>
-          <w:b/>
-          <w:bCs/>
-        </w:rPr>
-        <w:t xml:space="preserve">Export button not working</w:t>
-      </w:r>
-    </w:p>
-    <w:p>
-      <w:pPr>
-        <w:spacing w:after="80"/>
-      </w:pPr>
-      <w:r>
-        <w:t xml:space="preserve">Problem: Click export option but nothing happens or download fails</w:t>
-      </w:r>
-    </w:p>
-    <w:p>
-      <w:pPr>
-        <w:spacing w:after="80"/>
-      </w:pPr>
-      <w:r>
-        <w:t xml:space="preserve">Solutions:</w:t>
-      </w:r>
-    </w:p>
-    <w:p>
-      <w:pPr>
-        <w:pStyle w:val="ListParagraph"/>
-        <w:numPr>
-          <w:ilvl w:val="0"/>
-          <w:numId w:val="3"/>
-        </w:numPr>
-        <w:spacing w:after="60"/>
-      </w:pPr>
-      <w:r>
-        <w:t xml:space="preserve">Check your browser's download settings—downloads may be blocked</w:t>
-      </w:r>
-    </w:p>
-    <w:p>
-      <w:pPr>
-        <w:pStyle w:val="ListParagraph"/>
-        <w:numPr>
-          <w:ilvl w:val="0"/>
-          <w:numId w:val="3"/>
-        </w:numPr>
-        <w:spacing w:after="60"/>
-      </w:pPr>
-      <w:r>
-        <w:t xml:space="preserve">Look for a yellow notification bar at the top of browser</w:t>
-      </w:r>
-    </w:p>
-    <w:p>
-      <w:pPr>
-        <w:pStyle w:val="ListParagraph"/>
-        <w:numPr>
-          <w:ilvl w:val="0"/>
-          <w:numId w:val="3"/>
-        </w:numPr>
-        <w:spacing w:after="60"/>
-      </w:pPr>
-      <w:r>
-        <w:t xml:space="preserve">Allow downloads for this website in browser settings</w:t>
-      </w:r>
-    </w:p>
-    <w:p>
-      <w:pPr>
-        <w:pStyle w:val="ListParagraph"/>
-        <w:numPr>
-          <w:ilvl w:val="0"/>
-          <w:numId w:val="3"/>
-        </w:numPr>
-        <w:spacing w:after="60"/>
-      </w:pPr>
-      <w:r>
-        <w:t xml:space="preserve">Try a different browser</w:t>
-      </w:r>
-    </w:p>
-    <w:p>
-      <w:pPr>
-        <w:pStyle w:val="ListParagraph"/>
-        <w:numPr>
-          <w:ilvl w:val="0"/>
-          <w:numId w:val="3"/>
-        </w:numPr>
-        <w:spacing w:after="60"/>
-      </w:pPr>
-      <w:r>
-        <w:t xml:space="preserve">Try a different export format (HTML instead of DOCX)</w:t>
-      </w:r>
-    </w:p>
-    <w:p>
-      <w:pPr>
-        <w:pStyle w:val="ListParagraph"/>
-        <w:numPr>
-          <w:ilvl w:val="0"/>
-          <w:numId w:val="3"/>
-        </w:numPr>
-        <w:spacing w:after="60"/>
-      </w:pPr>
-      <w:r>
-        <w:t xml:space="preserve">Make sure you have enough disk space</w:t>
-      </w:r>
-    </w:p>
-    <w:p>
-      <w:pPr>
-        <w:pStyle w:val="ListParagraph"/>
-        <w:numPr>
-          <w:ilvl w:val="0"/>
-          <w:numId w:val="3"/>
-        </w:numPr>
-        <w:spacing w:after="60"/>
-      </w:pPr>
-      <w:r>
-        <w:t xml:space="preserve">Check if a popup blocker is preventing download dialog</w:t>
-      </w:r>
-    </w:p>
-    <w:p>
-      <w:pPr>
-        <w:pStyle w:val="Heading2"/>
-        <w:spacing w:after="120" w:before="240"/>
-      </w:pPr>
-      <w:r>
-        <w:rPr>
-          <w:b/>
-          <w:bCs/>
-        </w:rPr>
-        <w:t xml:space="preserve">DOCX file won't open / corrupted</w:t>
-      </w:r>
-    </w:p>
-    <w:p>
-      <w:pPr>
-        <w:spacing w:after="80"/>
-      </w:pPr>
-      <w:r>
-        <w:t xml:space="preserve">Problem: Downloaded DOCX file, but Word says it's corrupted</w:t>
-      </w:r>
-    </w:p>
-    <w:p>
-      <w:pPr>
-        <w:spacing w:after="80"/>
-      </w:pPr>
-      <w:r>
-        <w:t xml:space="preserve">Solutions:</w:t>
-      </w:r>
-    </w:p>
-    <w:p>
-      <w:pPr>
-        <w:pStyle w:val="ListParagraph"/>
-        <w:numPr>
-          <w:ilvl w:val="0"/>
-          <w:numId w:val="3"/>
-        </w:numPr>
-        <w:spacing w:after="60"/>
-      </w:pPr>
-      <w:r>
-        <w:t xml:space="preserve">Try opening in Google Docs instead (usually more forgiving)</w:t>
-      </w:r>
-    </w:p>
-    <w:p>
-      <w:pPr>
-        <w:pStyle w:val="ListParagraph"/>
-        <w:numPr>
-          <w:ilvl w:val="0"/>
-          <w:numId w:val="3"/>
-        </w:numPr>
-        <w:spacing w:after="60"/>
-      </w:pPr>
-      <w:r>
-        <w:t xml:space="preserve">Try HTML export instead—save as PDF from browser</w:t>
-      </w:r>
-    </w:p>
-    <w:p>
-      <w:pPr>
-        <w:pStyle w:val="ListParagraph"/>
-        <w:numPr>
-          <w:ilvl w:val="0"/>
-          <w:numId w:val="3"/>
-        </w:numPr>
-        <w:spacing w:after="60"/>
-      </w:pPr>
-      <w:r>
-        <w:t xml:space="preserve">Re-export the DOCX file (may have been incomplete download)</w:t>
-      </w:r>
-    </w:p>
-    <w:p>
-      <w:pPr>
-        <w:pStyle w:val="ListParagraph"/>
-        <w:numPr>
-          <w:ilvl w:val="0"/>
-          <w:numId w:val="3"/>
-        </w:numPr>
-        <w:spacing w:after="60"/>
-      </w:pPr>
-      <w:r>
-        <w:t xml:space="preserve">Check Downloads folder—file may not have fully downloaded</w:t>
-      </w:r>
-    </w:p>
-    <w:p>
-      <w:pPr>
-        <w:pStyle w:val="ListParagraph"/>
-        <w:numPr>
-          <w:ilvl w:val="0"/>
-          <w:numId w:val="3"/>
-        </w:numPr>
-        <w:spacing w:after="60"/>
-      </w:pPr>
-      <w:r>
-        <w:t xml:space="preserve">Try different browser to export (Chrome or Edge)</w:t>
-      </w:r>
-    </w:p>
-    <w:p>
-      <w:pPr>
-        <w:pStyle w:val="Heading2"/>
-        <w:spacing w:after="120" w:before="240"/>
-      </w:pPr>
-      <w:r>
-        <w:rPr>
-          <w:b/>
-          <w:bCs/>
-        </w:rPr>
-        <w:t xml:space="preserve">Canvas paste not working</w:t>
-      </w:r>
-    </w:p>
-    <w:p>
-      <w:pPr>
-        <w:spacing w:after="80"/>
-      </w:pPr>
-      <w:r>
-        <w:t xml:space="preserve">Problem: Exported HTML and tried to paste into Canvas, but formatting is broken</w:t>
-      </w:r>
-    </w:p>
-    <w:p>
-      <w:pPr>
-        <w:spacing w:after="80"/>
-      </w:pPr>
-      <w:r>
-        <w:t xml:space="preserve">Solutions:</w:t>
-      </w:r>
-    </w:p>
-    <w:p>
-      <w:pPr>
-        <w:pStyle w:val="ListParagraph"/>
-        <w:numPr>
-          <w:ilvl w:val="0"/>
-          <w:numId w:val="3"/>
-        </w:numPr>
-        <w:spacing w:after="60"/>
-      </w:pPr>
-      <w:r>
-        <w:t xml:space="preserve">Use Canvas HTML editor: Click 'Edit Page' → HTML Editor (not Rich Content Editor)</w:t>
-      </w:r>
-    </w:p>
-    <w:p>
-      <w:pPr>
-        <w:pStyle w:val="ListParagraph"/>
-        <w:numPr>
-          <w:ilvl w:val="0"/>
-          <w:numId w:val="3"/>
-        </w:numPr>
-        <w:spacing w:after="60"/>
-      </w:pPr>
-      <w:r>
-        <w:t xml:space="preserve">Clear formatting: In Canvas, use 'Remove Formatting' before pasting</w:t>
-      </w:r>
-    </w:p>
-    <w:p>
-      <w:pPr>
-        <w:pStyle w:val="ListParagraph"/>
-        <w:numPr>
-          <w:ilvl w:val="0"/>
-          <w:numId w:val="3"/>
-        </w:numPr>
-        <w:spacing w:after="60"/>
-      </w:pPr>
-      <w:r>
-        <w:t xml:space="preserve">Copy whole HTML: Make sure you copied entire HTML file content</w:t>
-      </w:r>
-    </w:p>
-    <w:p>
-      <w:pPr>
-        <w:pStyle w:val="ListParagraph"/>
-        <w:numPr>
-          <w:ilvl w:val="0"/>
-          <w:numId w:val="3"/>
-        </w:numPr>
-        <w:spacing w:after="60"/>
-      </w:pPr>
-      <w:r>
-        <w:t xml:space="preserve">Try as link instead: Save HTML file and link to it</w:t>
-      </w:r>
-    </w:p>
-    <w:p>
-      <w:pPr>
-        <w:pStyle w:val="ListParagraph"/>
-        <w:numPr>
-          <w:ilvl w:val="0"/>
-          <w:numId w:val="3"/>
-        </w:numPr>
-        <w:spacing w:after="60"/>
-      </w:pPr>
-      <w:r>
-        <w:t xml:space="preserve">Use DOCX instead: Export as DOCX, open in Word, copy section by section</w:t>
-      </w:r>
-    </w:p>
-    <w:p>
-      <w:pPr>
-        <w:pStyle w:val="Heading2"/>
-        <w:spacing w:after="120" w:before="240"/>
-      </w:pPr>
-      <w:r>
-        <w:rPr>
-          <w:b/>
-          <w:bCs/>
-        </w:rPr>
-        <w:t xml:space="preserve">Dates not calculating correctly for pacing</w:t>
-      </w:r>
-    </w:p>
-    <w:p>
-      <w:pPr>
-        <w:spacing w:after="80"/>
-      </w:pPr>
-      <w:r>
-        <w:t xml:space="preserve">Problem: Course dates seem wrong or instructional weeks calculation is off</w:t>
-      </w:r>
-    </w:p>
-    <w:p>
-      <w:pPr>
-        <w:spacing w:after="80"/>
-      </w:pPr>
-      <w:r>
-        <w:t xml:space="preserve">Solutions:</w:t>
-      </w:r>
-    </w:p>
-    <w:p>
-      <w:pPr>
-        <w:pStyle w:val="ListParagraph"/>
-        <w:numPr>
-          <w:ilvl w:val="0"/>
-          <w:numId w:val="3"/>
-        </w:numPr>
-        <w:spacing w:after="60"/>
-      </w:pPr>
-      <w:r>
-        <w:t xml:space="preserve">Check your start and end dates in Phase 1—make sure they're correct</w:t>
-      </w:r>
-    </w:p>
-    <w:p>
-      <w:pPr>
-        <w:pStyle w:val="ListParagraph"/>
-        <w:numPr>
-          <w:ilvl w:val="0"/>
-          <w:numId w:val="3"/>
-        </w:numPr>
-        <w:spacing w:after="60"/>
-      </w:pPr>
-      <w:r>
-        <w:t xml:space="preserve">In Phase 3, verify all holidays are marked correctly</w:t>
-      </w:r>
-    </w:p>
-    <w:p>
-      <w:pPr>
-        <w:pStyle w:val="ListParagraph"/>
-        <w:numPr>
-          <w:ilvl w:val="0"/>
-          <w:numId w:val="3"/>
-        </w:numPr>
-        <w:spacing w:after="60"/>
-      </w:pPr>
-      <w:r>
-        <w:t xml:space="preserve">Check that you selected the right meeting days</w:t>
-      </w:r>
-    </w:p>
-    <w:p>
-      <w:pPr>
-        <w:pStyle w:val="ListParagraph"/>
-        <w:numPr>
-          <w:ilvl w:val="0"/>
-          <w:numId w:val="3"/>
-        </w:numPr>
-        <w:spacing w:after="60"/>
-      </w:pPr>
-      <w:r>
-        <w:t xml:space="preserve">Remember: App counts ONLY actual instructional days</w:t>
-      </w:r>
-    </w:p>
-    <w:p>
-      <w:pPr>
-        <w:pStyle w:val="ListParagraph"/>
-        <w:numPr>
-          <w:ilvl w:val="0"/>
-          <w:numId w:val="3"/>
-        </w:numPr>
-        <w:spacing w:after="60"/>
-      </w:pPr>
-      <w:r>
-        <w:t xml:space="preserve">Manual adjustment: Adjust 'Est. Weeks' in Phase 4 if needed</w:t>
-      </w:r>
-    </w:p>
-    <w:p>
-      <w:pPr>
-        <w:pStyle w:val="Heading2"/>
-        <w:spacing w:after="120" w:before="240"/>
-      </w:pPr>
-      <w:r>
-        <w:rPr>
-          <w:b/>
-          <w:bCs/>
-        </w:rPr>
-        <w:t xml:space="preserve">Browser back button goes away from app</w:t>
-      </w:r>
-    </w:p>
-    <w:p>
-      <w:pPr>
-        <w:spacing w:after="80"/>
-      </w:pPr>
-      <w:r>
-        <w:t xml:space="preserve">Problem: Clicking browser back button closes the app instead of going back a phase</w:t>
-      </w:r>
-    </w:p>
-    <w:p>
-      <w:pPr>
-        <w:spacing w:after="80"/>
-      </w:pPr>
-      <w:r>
-        <w:t xml:space="preserve">Solution: Always use the app's '← Back' button inside the form, not your browser's back button.</w:t>
-      </w:r>
-    </w:p>
-    <w:p>
-      <w:r>
-        <w:br w:type="page"/>
-      </w:r>
-    </w:p>
-    <w:p>
-      <w:pPr>
-        <w:pStyle w:val="Heading1"/>
-        <w:spacing w:after="120" w:before="240"/>
-      </w:pPr>
-      <w:r>
-        <w:rPr>
-          <w:b/>
-          <w:bCs/>
-        </w:rPr>
-        <w:t xml:space="preserve">5. Best Practices &amp; Professional Tips</w:t>
-      </w:r>
-    </w:p>
-    <w:p>
-      <w:pPr>
-        <w:pStyle w:val="Heading2"/>
-        <w:spacing w:after="120" w:before="240"/>
-      </w:pPr>
-      <w:r>
-        <w:rPr>
-          <w:b/>
-          <w:bCs/>
-        </w:rPr>
-        <w:t xml:space="preserve">Tip 1: Start with your planning documents</w:t>
-      </w:r>
-    </w:p>
-    <w:p>
-      <w:pPr>
-        <w:spacing w:after="80"/>
-      </w:pPr>
-      <w:r>
-        <w:t xml:space="preserve">Before opening the app, gather:</w:t>
-      </w:r>
-    </w:p>
-    <w:p>
-      <w:pPr>
-        <w:pStyle w:val="ListParagraph"/>
-        <w:numPr>
-          <w:ilvl w:val="0"/>
-          <w:numId w:val="2"/>
-        </w:numPr>
-        <w:spacing w:after="60"/>
-      </w:pPr>
-      <w:r>
-        <w:t xml:space="preserve">Your program of studies (PDF or curriculum document)</w:t>
-      </w:r>
-    </w:p>
-    <w:p>
-      <w:pPr>
-        <w:pStyle w:val="ListParagraph"/>
-        <w:numPr>
-          <w:ilvl w:val="0"/>
-          <w:numId w:val="2"/>
-        </w:numPr>
-        <w:spacing w:after="60"/>
-      </w:pPr>
-      <w:r>
-        <w:t xml:space="preserve">School calendar (dates of holidays, breaks, PD days)</w:t>
-      </w:r>
-    </w:p>
-    <w:p>
-      <w:pPr>
-        <w:pStyle w:val="ListParagraph"/>
-        <w:numPr>
-          <w:ilvl w:val="0"/>
-          <w:numId w:val="2"/>
-        </w:numPr>
-        <w:spacing w:after="60"/>
-      </w:pPr>
-      <w:r>
-        <w:t xml:space="preserve">Your class schedule (which days/times you teach)</w:t>
-      </w:r>
-    </w:p>
-    <w:p>
-      <w:pPr>
-        <w:pStyle w:val="ListParagraph"/>
-        <w:numPr>
-          <w:ilvl w:val="0"/>
-          <w:numId w:val="2"/>
-        </w:numPr>
-        <w:spacing w:after="60"/>
-      </w:pPr>
-      <w:r>
-        <w:t xml:space="preserve">Your grading rubric or existing syllabus</w:t>
-      </w:r>
-    </w:p>
-    <w:p>
-      <w:pPr>
-        <w:spacing w:after="80"/>
-      </w:pPr>
-      <w:r>
-        <w:t xml:space="preserve">Why: You can upload these to auto-populate data, saving time.</w:t>
+        <w:t xml:space="preserve">Why: You can upload your program of studies to auto-populate unit data, saving time.</w:t>
       </w:r>
     </w:p>
     <w:p>
@@ -6763,7 +6219,7 @@
           </w:tcPr>
           <w:p>
             <w:r>
-              <w:t xml:space="preserve">One of the 6 steps in the workflow (Setup, Documents, Calendar, Curriculum, Review, Export)</w:t>
+              <w:t xml:space="preserve">One of the 5 steps in the workflow (Setup, Documents, Curriculum, Review, Export)</w:t>
             </w:r>
           </w:p>
         </w:tc>
@@ -6826,17 +6282,17 @@
               <w:bottom w:val="single" w:color="CCCCCC" w:sz="1"/>
               <w:right w:val="single" w:color="CCCCCC" w:sz="1"/>
             </w:tcBorders>
-            <w:shd w:fill="FFFFFF" w:val="clear"/>
-            <w:tcMar>
-              <w:top w:type="dxa" w:w="80"/>
-              <w:left w:type="dxa" w:w="120"/>
-              <w:bottom w:type="dxa" w:w="80"/>
-              <w:right w:type="dxa" w:w="120"/>
-            </w:tcMar>
-          </w:tcPr>
-          <w:p>
-            <w:r>
-              <w:t xml:space="preserve">Instructional Days</w:t>
+            <w:shd w:fill="F9FAFB" w:val="clear"/>
+            <w:tcMar>
+              <w:top w:type="dxa" w:w="80"/>
+              <w:left w:type="dxa" w:w="120"/>
+              <w:bottom w:type="dxa" w:w="80"/>
+              <w:right w:type="dxa" w:w="120"/>
+            </w:tcMar>
+          </w:tcPr>
+          <w:p>
+            <w:r>
+              <w:t xml:space="preserve">Pacing</w:t>
             </w:r>
           </w:p>
         </w:tc>
@@ -6849,31 +6305,6 @@
               <w:bottom w:val="single" w:color="CCCCCC" w:sz="1"/>
               <w:right w:val="single" w:color="CCCCCC" w:sz="1"/>
             </w:tcBorders>
-            <w:shd w:fill="FFFFFF" w:val="clear"/>
-            <w:tcMar>
-              <w:top w:type="dxa" w:w="80"/>
-              <w:left w:type="dxa" w:w="120"/>
-              <w:bottom w:type="dxa" w:w="80"/>
-              <w:right w:type="dxa" w:w="120"/>
-            </w:tcMar>
-          </w:tcPr>
-          <w:p>
-            <w:r>
-              <w:t xml:space="preserve">Days when school is in session (excludes weekends, holidays, breaks)</w:t>
-            </w:r>
-          </w:p>
-        </w:tc>
-      </w:tr>
-      <w:tr>
-        <w:tc>
-          <w:tcPr>
-            <w:tcW w:type="dxa" w:w="4680"/>
-            <w:tcBorders>
-              <w:top w:val="single" w:color="CCCCCC" w:sz="1"/>
-              <w:left w:val="single" w:color="CCCCCC" w:sz="1"/>
-              <w:bottom w:val="single" w:color="CCCCCC" w:sz="1"/>
-              <w:right w:val="single" w:color="CCCCCC" w:sz="1"/>
-            </w:tcBorders>
             <w:shd w:fill="F9FAFB" w:val="clear"/>
             <w:tcMar>
               <w:top w:type="dxa" w:w="80"/>
@@ -6884,30 +6315,7 @@
           </w:tcPr>
           <w:p>
             <w:r>
-              <w:t xml:space="preserve">Pacing</w:t>
-            </w:r>
-          </w:p>
-        </w:tc>
-        <w:tc>
-          <w:tcPr>
-            <w:tcW w:type="dxa" w:w="4680"/>
-            <w:tcBorders>
-              <w:top w:val="single" w:color="CCCCCC" w:sz="1"/>
-              <w:left w:val="single" w:color="CCCCCC" w:sz="1"/>
-              <w:bottom w:val="single" w:color="CCCCCC" w:sz="1"/>
-              <w:right w:val="single" w:color="CCCCCC" w:sz="1"/>
-            </w:tcBorders>
-            <w:shd w:fill="F9FAFB" w:val="clear"/>
-            <w:tcMar>
-              <w:top w:type="dxa" w:w="80"/>
-              <w:left w:type="dxa" w:w="120"/>
-              <w:bottom w:type="dxa" w:w="80"/>
-              <w:right w:type="dxa" w:w="120"/>
-            </w:tcMar>
-          </w:tcPr>
-          <w:p>
-            <w:r>
-              <w:t xml:space="preserve">The schedule for when you'll teach each unit, based on available instructional days</w:t>
+              <w:t xml:space="preserve">The schedule for when you'll teach each unit, based on the 'Weeks (Est.)' you set for each unit</w:t>
             </w:r>
           </w:p>
         </w:tc>

</xml_diff>